<commit_message>
docs(acpos): resolve 42 owner-specific read-source gaps
</commit_message>
<xml_diff>
--- a/ACPOS_DB-01_MOTHER_BASIC_DESIGN_TECH_PURPLE_v1.0.docx
+++ b/ACPOS_DB-01_MOTHER_BASIC_DESIGN_TECH_PURPLE_v1.0.docx
@@ -32092,9 +32092,798 @@
         <w:t>The exact control denominator above is the only construction denominator for this page. Components/fields/visual IDs are not counted as additional controls. Existing source UIDs are preserved. A control classified UI_LOCAL_EXACT MUST NOT create a server write. A control classified SPEC_EXACT_RUNTIME_BLOCKED / NOT_EXECUTED MUST remain disabled or fail-closed until its runtime evidence exists.</w:t>
       </w:r>
     </w:p>
+    <w:p>
+      <w:pPr>
+        <w:sectPr>
+          <w:pgSz w:w="15840" w:h="12240" w:orient="landscape"/>
+          <w:pgMar w:top="576" w:right="504" w:bottom="576" w:left="504" w:header="259" w:footer="259" w:gutter="0"/>
+          <w:cols w:space="720"/>
+          <w:docGrid w:linePitch="360"/>
+        </w:sectPr>
+      </w:pPr>
+    </w:p>
+    <w:p>
+      <w:pPr>
+        <w:pStyle w:val="Heading1"/>
+      </w:pPr>
+      <w:r>
+        <w:t>Batch 15 · DB Read-Model Operation Applicability Ledger</w:t>
+      </w:r>
+    </w:p>
+    <w:p>
+      <w:r>
+        <w:rPr>
+          <w:b/>
+        </w:rPr>
+        <w:t xml:space="preserve">[ACPOS-20260921-BATCH-15-OWNER-SPECIFIC-READ-PROJECTION-CLOSURE-V1::PAGE::DB-01] </w:t>
+      </w:r>
+      <w:r>
+        <w:t>Applicability-only ledger. Product Control Registry rows remain unchanged; Operation stays '—'. Target UID is used so this evidence table is not a second product-control denominator.</w:t>
+      </w:r>
+    </w:p>
+    <w:tbl>
+      <w:tblPr>
+        <w:tblStyle w:val="TableGrid"/>
+        <w:tblW w:type="auto" w:w="0"/>
+        <w:tblLook w:firstColumn="1" w:firstRow="1" w:lastColumn="0" w:lastRow="0" w:noHBand="0" w:noVBand="1" w:val="04A0"/>
+      </w:tblPr>
+      <w:tblGrid>
+        <w:gridCol w:w="2287"/>
+        <w:gridCol w:w="2287"/>
+        <w:gridCol w:w="2287"/>
+        <w:gridCol w:w="2287"/>
+        <w:gridCol w:w="2287"/>
+      </w:tblGrid>
+      <w:tr>
+        <w:trPr>
+          <w:tblHeader w:val="true"/>
+        </w:trPr>
+        <w:tc>
+          <w:tcPr>
+            <w:tcW w:type="dxa" w:w="2287"/>
+            <w:shd w:fill="EDE9FE"/>
+          </w:tcPr>
+          <w:p>
+            <w:pPr>
+              <w:spacing w:before="0" w:after="0"/>
+            </w:pPr>
+            <w:r>
+              <w:rPr>
+                <w:sz w:val="9"/>
+              </w:rPr>
+              <w:t>Target UID</w:t>
+            </w:r>
+          </w:p>
+        </w:tc>
+        <w:tc>
+          <w:tcPr>
+            <w:tcW w:type="dxa" w:w="2287"/>
+            <w:shd w:fill="EDE9FE"/>
+          </w:tcPr>
+          <w:p>
+            <w:pPr>
+              <w:spacing w:before="0" w:after="0"/>
+            </w:pPr>
+            <w:r>
+              <w:rPr>
+                <w:sz w:val="9"/>
+              </w:rPr>
+              <w:t>Field</w:t>
+            </w:r>
+          </w:p>
+        </w:tc>
+        <w:tc>
+          <w:tcPr>
+            <w:tcW w:type="dxa" w:w="2287"/>
+            <w:shd w:fill="EDE9FE"/>
+          </w:tcPr>
+          <w:p>
+            <w:pPr>
+              <w:spacing w:before="0" w:after="0"/>
+            </w:pPr>
+            <w:r>
+              <w:rPr>
+                <w:sz w:val="9"/>
+              </w:rPr>
+              <w:t>Current Cell</w:t>
+            </w:r>
+          </w:p>
+        </w:tc>
+        <w:tc>
+          <w:tcPr>
+            <w:tcW w:type="dxa" w:w="2287"/>
+            <w:shd w:fill="EDE9FE"/>
+          </w:tcPr>
+          <w:p>
+            <w:pPr>
+              <w:spacing w:before="0" w:after="0"/>
+            </w:pPr>
+            <w:r>
+              <w:rPr>
+                <w:sz w:val="9"/>
+              </w:rPr>
+              <w:t>Owner</w:t>
+            </w:r>
+          </w:p>
+        </w:tc>
+        <w:tc>
+          <w:tcPr>
+            <w:tcW w:type="dxa" w:w="2287"/>
+            <w:shd w:fill="EDE9FE"/>
+          </w:tcPr>
+          <w:p>
+            <w:pPr>
+              <w:spacing w:before="0" w:after="0"/>
+            </w:pPr>
+            <w:r>
+              <w:rPr>
+                <w:sz w:val="9"/>
+              </w:rPr>
+              <w:t>Handling</w:t>
+            </w:r>
+          </w:p>
+        </w:tc>
+      </w:tr>
+      <w:tr>
+        <w:tc>
+          <w:tcPr>
+            <w:tcW w:type="dxa" w:w="2287"/>
+          </w:tcPr>
+          <w:p>
+            <w:pPr>
+              <w:spacing w:before="0" w:after="0"/>
+            </w:pPr>
+            <w:r>
+              <w:rPr>
+                <w:sz w:val="9"/>
+              </w:rPr>
+              <w:t>DB-01-BTN-AUDIT</w:t>
+            </w:r>
+          </w:p>
+        </w:tc>
+        <w:tc>
+          <w:tcPr>
+            <w:tcW w:type="dxa" w:w="2287"/>
+          </w:tcPr>
+          <w:p>
+            <w:pPr>
+              <w:spacing w:before="0" w:after="0"/>
+            </w:pPr>
+            <w:r>
+              <w:rPr>
+                <w:sz w:val="9"/>
+              </w:rPr>
+              <w:t>Operation</w:t>
+            </w:r>
+          </w:p>
+        </w:tc>
+        <w:tc>
+          <w:tcPr>
+            <w:tcW w:type="dxa" w:w="2287"/>
+          </w:tcPr>
+          <w:p>
+            <w:pPr>
+              <w:spacing w:before="0" w:after="0"/>
+            </w:pPr>
+            <w:r>
+              <w:rPr>
+                <w:sz w:val="9"/>
+              </w:rPr>
+              <w:t>—</w:t>
+            </w:r>
+          </w:p>
+        </w:tc>
+        <w:tc>
+          <w:tcPr>
+            <w:tcW w:type="dxa" w:w="2287"/>
+          </w:tcPr>
+          <w:p>
+            <w:pPr>
+              <w:spacing w:before="0" w:after="0"/>
+            </w:pPr>
+            <w:r>
+              <w:rPr>
+                <w:sz w:val="9"/>
+              </w:rPr>
+              <w:t>Database Read Model / DB-01</w:t>
+            </w:r>
+          </w:p>
+        </w:tc>
+        <w:tc>
+          <w:tcPr>
+            <w:tcW w:type="dxa" w:w="2287"/>
+          </w:tcPr>
+          <w:p>
+            <w:pPr>
+              <w:spacing w:before="0" w:after="0"/>
+            </w:pPr>
+            <w:r>
+              <w:rPr>
+                <w:sz w:val="9"/>
+              </w:rPr>
+              <w:t>DO_NOT_INVENT_REGISTERED_OPERATION</w:t>
+            </w:r>
+          </w:p>
+        </w:tc>
+      </w:tr>
+      <w:tr>
+        <w:tc>
+          <w:tcPr>
+            <w:tcW w:type="dxa" w:w="2287"/>
+          </w:tcPr>
+          <w:p>
+            <w:pPr>
+              <w:spacing w:before="0" w:after="0"/>
+            </w:pPr>
+            <w:r>
+              <w:rPr>
+                <w:sz w:val="9"/>
+              </w:rPr>
+              <w:t>DB-01-BTN-INTEGRITY-REFRESH</w:t>
+            </w:r>
+          </w:p>
+        </w:tc>
+        <w:tc>
+          <w:tcPr>
+            <w:tcW w:type="dxa" w:w="2287"/>
+          </w:tcPr>
+          <w:p>
+            <w:pPr>
+              <w:spacing w:before="0" w:after="0"/>
+            </w:pPr>
+            <w:r>
+              <w:rPr>
+                <w:sz w:val="9"/>
+              </w:rPr>
+              <w:t>Operation</w:t>
+            </w:r>
+          </w:p>
+        </w:tc>
+        <w:tc>
+          <w:tcPr>
+            <w:tcW w:type="dxa" w:w="2287"/>
+          </w:tcPr>
+          <w:p>
+            <w:pPr>
+              <w:spacing w:before="0" w:after="0"/>
+            </w:pPr>
+            <w:r>
+              <w:rPr>
+                <w:sz w:val="9"/>
+              </w:rPr>
+              <w:t>—</w:t>
+            </w:r>
+          </w:p>
+        </w:tc>
+        <w:tc>
+          <w:tcPr>
+            <w:tcW w:type="dxa" w:w="2287"/>
+          </w:tcPr>
+          <w:p>
+            <w:pPr>
+              <w:spacing w:before="0" w:after="0"/>
+            </w:pPr>
+            <w:r>
+              <w:rPr>
+                <w:sz w:val="9"/>
+              </w:rPr>
+              <w:t>Database Read Model / DB-01</w:t>
+            </w:r>
+          </w:p>
+        </w:tc>
+        <w:tc>
+          <w:tcPr>
+            <w:tcW w:type="dxa" w:w="2287"/>
+          </w:tcPr>
+          <w:p>
+            <w:pPr>
+              <w:spacing w:before="0" w:after="0"/>
+            </w:pPr>
+            <w:r>
+              <w:rPr>
+                <w:sz w:val="9"/>
+              </w:rPr>
+              <w:t>DO_NOT_INVENT_REGISTERED_OPERATION</w:t>
+            </w:r>
+          </w:p>
+        </w:tc>
+      </w:tr>
+      <w:tr>
+        <w:tc>
+          <w:tcPr>
+            <w:tcW w:type="dxa" w:w="2287"/>
+          </w:tcPr>
+          <w:p>
+            <w:pPr>
+              <w:spacing w:before="0" w:after="0"/>
+            </w:pPr>
+            <w:r>
+              <w:rPr>
+                <w:sz w:val="9"/>
+              </w:rPr>
+              <w:t>DB-01-BTN-MIGRATION-REFRESH</w:t>
+            </w:r>
+          </w:p>
+        </w:tc>
+        <w:tc>
+          <w:tcPr>
+            <w:tcW w:type="dxa" w:w="2287"/>
+          </w:tcPr>
+          <w:p>
+            <w:pPr>
+              <w:spacing w:before="0" w:after="0"/>
+            </w:pPr>
+            <w:r>
+              <w:rPr>
+                <w:sz w:val="9"/>
+              </w:rPr>
+              <w:t>Operation</w:t>
+            </w:r>
+          </w:p>
+        </w:tc>
+        <w:tc>
+          <w:tcPr>
+            <w:tcW w:type="dxa" w:w="2287"/>
+          </w:tcPr>
+          <w:p>
+            <w:pPr>
+              <w:spacing w:before="0" w:after="0"/>
+            </w:pPr>
+            <w:r>
+              <w:rPr>
+                <w:sz w:val="9"/>
+              </w:rPr>
+              <w:t>—</w:t>
+            </w:r>
+          </w:p>
+        </w:tc>
+        <w:tc>
+          <w:tcPr>
+            <w:tcW w:type="dxa" w:w="2287"/>
+          </w:tcPr>
+          <w:p>
+            <w:pPr>
+              <w:spacing w:before="0" w:after="0"/>
+            </w:pPr>
+            <w:r>
+              <w:rPr>
+                <w:sz w:val="9"/>
+              </w:rPr>
+              <w:t>Database Read Model / DB-01</w:t>
+            </w:r>
+          </w:p>
+        </w:tc>
+        <w:tc>
+          <w:tcPr>
+            <w:tcW w:type="dxa" w:w="2287"/>
+          </w:tcPr>
+          <w:p>
+            <w:pPr>
+              <w:spacing w:before="0" w:after="0"/>
+            </w:pPr>
+            <w:r>
+              <w:rPr>
+                <w:sz w:val="9"/>
+              </w:rPr>
+              <w:t>DO_NOT_INVENT_REGISTERED_OPERATION</w:t>
+            </w:r>
+          </w:p>
+        </w:tc>
+      </w:tr>
+      <w:tr>
+        <w:tc>
+          <w:tcPr>
+            <w:tcW w:type="dxa" w:w="2287"/>
+          </w:tcPr>
+          <w:p>
+            <w:pPr>
+              <w:spacing w:before="0" w:after="0"/>
+            </w:pPr>
+            <w:r>
+              <w:rPr>
+                <w:sz w:val="9"/>
+              </w:rPr>
+              <w:t>DB-01-BTN-REFRESH</w:t>
+            </w:r>
+          </w:p>
+        </w:tc>
+        <w:tc>
+          <w:tcPr>
+            <w:tcW w:type="dxa" w:w="2287"/>
+          </w:tcPr>
+          <w:p>
+            <w:pPr>
+              <w:spacing w:before="0" w:after="0"/>
+            </w:pPr>
+            <w:r>
+              <w:rPr>
+                <w:sz w:val="9"/>
+              </w:rPr>
+              <w:t>Operation</w:t>
+            </w:r>
+          </w:p>
+        </w:tc>
+        <w:tc>
+          <w:tcPr>
+            <w:tcW w:type="dxa" w:w="2287"/>
+          </w:tcPr>
+          <w:p>
+            <w:pPr>
+              <w:spacing w:before="0" w:after="0"/>
+            </w:pPr>
+            <w:r>
+              <w:rPr>
+                <w:sz w:val="9"/>
+              </w:rPr>
+              <w:t>—</w:t>
+            </w:r>
+          </w:p>
+        </w:tc>
+        <w:tc>
+          <w:tcPr>
+            <w:tcW w:type="dxa" w:w="2287"/>
+          </w:tcPr>
+          <w:p>
+            <w:pPr>
+              <w:spacing w:before="0" w:after="0"/>
+            </w:pPr>
+            <w:r>
+              <w:rPr>
+                <w:sz w:val="9"/>
+              </w:rPr>
+              <w:t>Database Read Model / DB-01</w:t>
+            </w:r>
+          </w:p>
+        </w:tc>
+        <w:tc>
+          <w:tcPr>
+            <w:tcW w:type="dxa" w:w="2287"/>
+          </w:tcPr>
+          <w:p>
+            <w:pPr>
+              <w:spacing w:before="0" w:after="0"/>
+            </w:pPr>
+            <w:r>
+              <w:rPr>
+                <w:sz w:val="9"/>
+              </w:rPr>
+              <w:t>DO_NOT_INVENT_REGISTERED_OPERATION</w:t>
+            </w:r>
+          </w:p>
+        </w:tc>
+      </w:tr>
+      <w:tr>
+        <w:tc>
+          <w:tcPr>
+            <w:tcW w:type="dxa" w:w="2287"/>
+          </w:tcPr>
+          <w:p>
+            <w:pPr>
+              <w:spacing w:before="0" w:after="0"/>
+            </w:pPr>
+            <w:r>
+              <w:rPr>
+                <w:sz w:val="9"/>
+              </w:rPr>
+              <w:t>DB-01-BTN-SCHEMA-REFRESH</w:t>
+            </w:r>
+          </w:p>
+        </w:tc>
+        <w:tc>
+          <w:tcPr>
+            <w:tcW w:type="dxa" w:w="2287"/>
+          </w:tcPr>
+          <w:p>
+            <w:pPr>
+              <w:spacing w:before="0" w:after="0"/>
+            </w:pPr>
+            <w:r>
+              <w:rPr>
+                <w:sz w:val="9"/>
+              </w:rPr>
+              <w:t>Operation</w:t>
+            </w:r>
+          </w:p>
+        </w:tc>
+        <w:tc>
+          <w:tcPr>
+            <w:tcW w:type="dxa" w:w="2287"/>
+          </w:tcPr>
+          <w:p>
+            <w:pPr>
+              <w:spacing w:before="0" w:after="0"/>
+            </w:pPr>
+            <w:r>
+              <w:rPr>
+                <w:sz w:val="9"/>
+              </w:rPr>
+              <w:t>—</w:t>
+            </w:r>
+          </w:p>
+        </w:tc>
+        <w:tc>
+          <w:tcPr>
+            <w:tcW w:type="dxa" w:w="2287"/>
+          </w:tcPr>
+          <w:p>
+            <w:pPr>
+              <w:spacing w:before="0" w:after="0"/>
+            </w:pPr>
+            <w:r>
+              <w:rPr>
+                <w:sz w:val="9"/>
+              </w:rPr>
+              <w:t>Database Read Model / DB-01</w:t>
+            </w:r>
+          </w:p>
+        </w:tc>
+        <w:tc>
+          <w:tcPr>
+            <w:tcW w:type="dxa" w:w="2287"/>
+          </w:tcPr>
+          <w:p>
+            <w:pPr>
+              <w:spacing w:before="0" w:after="0"/>
+            </w:pPr>
+            <w:r>
+              <w:rPr>
+                <w:sz w:val="9"/>
+              </w:rPr>
+              <w:t>DO_NOT_INVENT_REGISTERED_OPERATION</w:t>
+            </w:r>
+          </w:p>
+        </w:tc>
+      </w:tr>
+      <w:tr>
+        <w:tc>
+          <w:tcPr>
+            <w:tcW w:type="dxa" w:w="2287"/>
+          </w:tcPr>
+          <w:p>
+            <w:pPr>
+              <w:spacing w:before="0" w:after="0"/>
+            </w:pPr>
+            <w:r>
+              <w:rPr>
+                <w:sz w:val="9"/>
+              </w:rPr>
+              <w:t>DB-01-BTN-TRACE</w:t>
+            </w:r>
+          </w:p>
+        </w:tc>
+        <w:tc>
+          <w:tcPr>
+            <w:tcW w:type="dxa" w:w="2287"/>
+          </w:tcPr>
+          <w:p>
+            <w:pPr>
+              <w:spacing w:before="0" w:after="0"/>
+            </w:pPr>
+            <w:r>
+              <w:rPr>
+                <w:sz w:val="9"/>
+              </w:rPr>
+              <w:t>Operation</w:t>
+            </w:r>
+          </w:p>
+        </w:tc>
+        <w:tc>
+          <w:tcPr>
+            <w:tcW w:type="dxa" w:w="2287"/>
+          </w:tcPr>
+          <w:p>
+            <w:pPr>
+              <w:spacing w:before="0" w:after="0"/>
+            </w:pPr>
+            <w:r>
+              <w:rPr>
+                <w:sz w:val="9"/>
+              </w:rPr>
+              <w:t>—</w:t>
+            </w:r>
+          </w:p>
+        </w:tc>
+        <w:tc>
+          <w:tcPr>
+            <w:tcW w:type="dxa" w:w="2287"/>
+          </w:tcPr>
+          <w:p>
+            <w:pPr>
+              <w:spacing w:before="0" w:after="0"/>
+            </w:pPr>
+            <w:r>
+              <w:rPr>
+                <w:sz w:val="9"/>
+              </w:rPr>
+              <w:t>Database Read Model / DB-01</w:t>
+            </w:r>
+          </w:p>
+        </w:tc>
+        <w:tc>
+          <w:tcPr>
+            <w:tcW w:type="dxa" w:w="2287"/>
+          </w:tcPr>
+          <w:p>
+            <w:pPr>
+              <w:spacing w:before="0" w:after="0"/>
+            </w:pPr>
+            <w:r>
+              <w:rPr>
+                <w:sz w:val="9"/>
+              </w:rPr>
+              <w:t>DO_NOT_INVENT_REGISTERED_OPERATION</w:t>
+            </w:r>
+          </w:p>
+        </w:tc>
+      </w:tr>
+      <w:tr>
+        <w:tc>
+          <w:tcPr>
+            <w:tcW w:type="dxa" w:w="2287"/>
+          </w:tcPr>
+          <w:p>
+            <w:pPr>
+              <w:spacing w:before="0" w:after="0"/>
+            </w:pPr>
+            <w:r>
+              <w:rPr>
+                <w:sz w:val="9"/>
+              </w:rPr>
+              <w:t>DB-01-INP-MIGRATION-SEARCH</w:t>
+            </w:r>
+          </w:p>
+        </w:tc>
+        <w:tc>
+          <w:tcPr>
+            <w:tcW w:type="dxa" w:w="2287"/>
+          </w:tcPr>
+          <w:p>
+            <w:pPr>
+              <w:spacing w:before="0" w:after="0"/>
+            </w:pPr>
+            <w:r>
+              <w:rPr>
+                <w:sz w:val="9"/>
+              </w:rPr>
+              <w:t>Operation</w:t>
+            </w:r>
+          </w:p>
+        </w:tc>
+        <w:tc>
+          <w:tcPr>
+            <w:tcW w:type="dxa" w:w="2287"/>
+          </w:tcPr>
+          <w:p>
+            <w:pPr>
+              <w:spacing w:before="0" w:after="0"/>
+            </w:pPr>
+            <w:r>
+              <w:rPr>
+                <w:sz w:val="9"/>
+              </w:rPr>
+              <w:t>—</w:t>
+            </w:r>
+          </w:p>
+        </w:tc>
+        <w:tc>
+          <w:tcPr>
+            <w:tcW w:type="dxa" w:w="2287"/>
+          </w:tcPr>
+          <w:p>
+            <w:pPr>
+              <w:spacing w:before="0" w:after="0"/>
+            </w:pPr>
+            <w:r>
+              <w:rPr>
+                <w:sz w:val="9"/>
+              </w:rPr>
+              <w:t>Database Read Model / DB-01</w:t>
+            </w:r>
+          </w:p>
+        </w:tc>
+        <w:tc>
+          <w:tcPr>
+            <w:tcW w:type="dxa" w:w="2287"/>
+          </w:tcPr>
+          <w:p>
+            <w:pPr>
+              <w:spacing w:before="0" w:after="0"/>
+            </w:pPr>
+            <w:r>
+              <w:rPr>
+                <w:sz w:val="9"/>
+              </w:rPr>
+              <w:t>DO_NOT_INVENT_REGISTERED_OPERATION</w:t>
+            </w:r>
+          </w:p>
+        </w:tc>
+      </w:tr>
+      <w:tr>
+        <w:tc>
+          <w:tcPr>
+            <w:tcW w:type="dxa" w:w="2287"/>
+          </w:tcPr>
+          <w:p>
+            <w:pPr>
+              <w:spacing w:before="0" w:after="0"/>
+            </w:pPr>
+            <w:r>
+              <w:rPr>
+                <w:sz w:val="9"/>
+              </w:rPr>
+              <w:t>DB-01-INP-SEARCH</w:t>
+            </w:r>
+          </w:p>
+        </w:tc>
+        <w:tc>
+          <w:tcPr>
+            <w:tcW w:type="dxa" w:w="2287"/>
+          </w:tcPr>
+          <w:p>
+            <w:pPr>
+              <w:spacing w:before="0" w:after="0"/>
+            </w:pPr>
+            <w:r>
+              <w:rPr>
+                <w:sz w:val="9"/>
+              </w:rPr>
+              <w:t>Operation</w:t>
+            </w:r>
+          </w:p>
+        </w:tc>
+        <w:tc>
+          <w:tcPr>
+            <w:tcW w:type="dxa" w:w="2287"/>
+          </w:tcPr>
+          <w:p>
+            <w:pPr>
+              <w:spacing w:before="0" w:after="0"/>
+            </w:pPr>
+            <w:r>
+              <w:rPr>
+                <w:sz w:val="9"/>
+              </w:rPr>
+              <w:t>—</w:t>
+            </w:r>
+          </w:p>
+        </w:tc>
+        <w:tc>
+          <w:tcPr>
+            <w:tcW w:type="dxa" w:w="2287"/>
+          </w:tcPr>
+          <w:p>
+            <w:pPr>
+              <w:spacing w:before="0" w:after="0"/>
+            </w:pPr>
+            <w:r>
+              <w:rPr>
+                <w:sz w:val="9"/>
+              </w:rPr>
+              <w:t>Database Read Model / DB-01</w:t>
+            </w:r>
+          </w:p>
+        </w:tc>
+        <w:tc>
+          <w:tcPr>
+            <w:tcW w:type="dxa" w:w="2287"/>
+          </w:tcPr>
+          <w:p>
+            <w:pPr>
+              <w:spacing w:before="0" w:after="0"/>
+            </w:pPr>
+            <w:r>
+              <w:rPr>
+                <w:sz w:val="9"/>
+              </w:rPr>
+              <w:t>DO_NOT_INVENT_REGISTERED_OPERATION</w:t>
+            </w:r>
+          </w:p>
+        </w:tc>
+      </w:tr>
+    </w:tbl>
     <w:sectPr>
-      <w:pgSz w:w="15840" w:h="12240" w:orient="landscape"/>
-      <w:pgMar w:top="576" w:right="504" w:bottom="576" w:left="504" w:header="259" w:footer="259" w:gutter="0"/>
+      <w:pgSz w:w="12240" w:h="15840" w:orient="landscape"/>
+      <w:pgMar w:top="475" w:right="403" w:bottom="475" w:left="403" w:header="259" w:footer="259" w:gutter="0"/>
       <w:cols w:space="720"/>
       <w:docGrid w:linePitch="360"/>
     </w:sectPr>

</xml_diff>

<commit_message>
fix(acpos): materialize canonical entity applicability matrices
</commit_message>
<xml_diff>
--- a/ACPOS_DB-01_MOTHER_BASIC_DESIGN_TECH_PURPLE_v1.0.docx
+++ b/ACPOS_DB-01_MOTHER_BASIC_DESIGN_TECH_PURPLE_v1.0.docx
@@ -32876,6 +32876,2954 @@
                 <w:sz w:val="9"/>
               </w:rPr>
               <w:t>DO_NOT_INVENT_REGISTERED_OPERATION</w:t>
+            </w:r>
+          </w:p>
+        </w:tc>
+      </w:tr>
+    </w:tbl>
+    <w:p>
+      <w:r>
+        <w:br w:type="page"/>
+      </w:r>
+    </w:p>
+    <w:p>
+      <w:pPr>
+        <w:pStyle w:val="Heading2"/>
+      </w:pPr>
+      <w:r>
+        <w:t>Canonical Business Entity Operation Applicability Matrix / 業務實體操作適用性矩陣</w:t>
+      </w:r>
+    </w:p>
+    <w:p>
+      <w:r>
+        <w:t>Authority: Current Word design + Mother §71 bounded completion. 本矩陣只正規化既有行為與目前未授權行為；不得據此新增 Business Entity、Operation、Runtime 或 API。 Current tree: b2f81b20322dd9e9268001126b07931b437e27df.</w:t>
+      </w:r>
+    </w:p>
+    <w:tbl>
+      <w:tblPr>
+        <w:tblStyle w:val="TableGrid"/>
+        <w:tblW w:type="auto" w:w="0"/>
+        <w:tblLook w:firstColumn="1" w:firstRow="1" w:lastColumn="0" w:lastRow="0" w:noHBand="0" w:noVBand="1" w:val="04A0"/>
+      </w:tblPr>
+      <w:tblGrid>
+        <w:gridCol w:w="2858"/>
+        <w:gridCol w:w="2858"/>
+        <w:gridCol w:w="2858"/>
+        <w:gridCol w:w="2858"/>
+      </w:tblGrid>
+      <w:tr>
+        <w:trPr>
+          <w:tblHeader w:val="true"/>
+        </w:trPr>
+        <w:tc>
+          <w:tcPr>
+            <w:tcW w:type="dxa" w:w="2858"/>
+          </w:tcPr>
+          <w:p>
+            <w:r/>
+            <w:r>
+              <w:rPr>
+                <w:b/>
+                <w:sz w:val="14"/>
+              </w:rPr>
+              <w:t>Entity</w:t>
+            </w:r>
+          </w:p>
+        </w:tc>
+        <w:tc>
+          <w:tcPr>
+            <w:tcW w:type="dxa" w:w="2858"/>
+          </w:tcPr>
+          <w:p>
+            <w:r/>
+            <w:r>
+              <w:rPr>
+                <w:b/>
+                <w:sz w:val="14"/>
+              </w:rPr>
+              <w:t>Operation</w:t>
+            </w:r>
+          </w:p>
+        </w:tc>
+        <w:tc>
+          <w:tcPr>
+            <w:tcW w:type="dxa" w:w="2858"/>
+          </w:tcPr>
+          <w:p>
+            <w:r/>
+            <w:r>
+              <w:rPr>
+                <w:b/>
+                <w:sz w:val="14"/>
+              </w:rPr>
+              <w:t>Applicability</w:t>
+            </w:r>
+          </w:p>
+        </w:tc>
+        <w:tc>
+          <w:tcPr>
+            <w:tcW w:type="dxa" w:w="2858"/>
+          </w:tcPr>
+          <w:p>
+            <w:r/>
+            <w:r>
+              <w:rPr>
+                <w:b/>
+                <w:sz w:val="14"/>
+              </w:rPr>
+              <w:t>Authority Evidence</w:t>
+            </w:r>
+          </w:p>
+        </w:tc>
+      </w:tr>
+      <w:tr>
+        <w:tc>
+          <w:tcPr>
+            <w:tcW w:type="dxa" w:w="2858"/>
+          </w:tcPr>
+          <w:p>
+            <w:r/>
+            <w:r>
+              <w:rPr>
+                <w:b w:val="0"/>
+                <w:sz w:val="14"/>
+              </w:rPr>
+              <w:t>DatabaseIntegrityFinding</w:t>
+            </w:r>
+          </w:p>
+        </w:tc>
+        <w:tc>
+          <w:tcPr>
+            <w:tcW w:type="dxa" w:w="2858"/>
+          </w:tcPr>
+          <w:p>
+            <w:r/>
+            <w:r>
+              <w:rPr>
+                <w:b w:val="0"/>
+                <w:sz w:val="14"/>
+              </w:rPr>
+              <w:t>ARCHIVE_OR_DELETE</w:t>
+            </w:r>
+          </w:p>
+        </w:tc>
+        <w:tc>
+          <w:tcPr>
+            <w:tcW w:type="dxa" w:w="2858"/>
+          </w:tcPr>
+          <w:p>
+            <w:r/>
+            <w:r>
+              <w:rPr>
+                <w:b w:val="0"/>
+                <w:sz w:val="14"/>
+              </w:rPr>
+              <w:t>NOT_APPLICABLE</w:t>
+            </w:r>
+          </w:p>
+        </w:tc>
+        <w:tc>
+          <w:tcPr>
+            <w:tcW w:type="dxa" w:w="2858"/>
+          </w:tcPr>
+          <w:p>
+            <w:r/>
+            <w:r>
+              <w:rPr>
+                <w:b w:val="0"/>
+                <w:sz w:val="14"/>
+              </w:rPr>
+              <w:t>Current exact tree b2f81b20322dd9e9268001126b07931b437e27df: zero entity-bound operation evidence for this entity/operation. Mother §71 forbids speculative CRUD/sibling-feature expansion; current revision authorizes no new behavior.</w:t>
+            </w:r>
+          </w:p>
+        </w:tc>
+      </w:tr>
+      <w:tr>
+        <w:tc>
+          <w:tcPr>
+            <w:tcW w:type="dxa" w:w="2858"/>
+          </w:tcPr>
+          <w:p>
+            <w:r/>
+            <w:r>
+              <w:rPr>
+                <w:b w:val="0"/>
+                <w:sz w:val="14"/>
+              </w:rPr>
+              <w:t>DatabaseIntegrityFinding</w:t>
+            </w:r>
+          </w:p>
+        </w:tc>
+        <w:tc>
+          <w:tcPr>
+            <w:tcW w:type="dxa" w:w="2858"/>
+          </w:tcPr>
+          <w:p>
+            <w:r/>
+            <w:r>
+              <w:rPr>
+                <w:b w:val="0"/>
+                <w:sz w:val="14"/>
+              </w:rPr>
+              <w:t>AUDIT</w:t>
+            </w:r>
+          </w:p>
+        </w:tc>
+        <w:tc>
+          <w:tcPr>
+            <w:tcW w:type="dxa" w:w="2858"/>
+          </w:tcPr>
+          <w:p>
+            <w:r/>
+            <w:r>
+              <w:rPr>
+                <w:b w:val="0"/>
+                <w:sz w:val="14"/>
+              </w:rPr>
+              <w:t>NOT_APPLICABLE</w:t>
+            </w:r>
+          </w:p>
+        </w:tc>
+        <w:tc>
+          <w:tcPr>
+            <w:tcW w:type="dxa" w:w="2858"/>
+          </w:tcPr>
+          <w:p>
+            <w:r/>
+            <w:r>
+              <w:rPr>
+                <w:b w:val="0"/>
+                <w:sz w:val="14"/>
+              </w:rPr>
+              <w:t>Current exact tree b2f81b20322dd9e9268001126b07931b437e27df: zero entity-bound operation evidence for this entity/operation. Mother §71 forbids speculative CRUD/sibling-feature expansion; current revision authorizes no new behavior.</w:t>
+            </w:r>
+          </w:p>
+        </w:tc>
+      </w:tr>
+      <w:tr>
+        <w:tc>
+          <w:tcPr>
+            <w:tcW w:type="dxa" w:w="2858"/>
+          </w:tcPr>
+          <w:p>
+            <w:r/>
+            <w:r>
+              <w:rPr>
+                <w:b w:val="0"/>
+                <w:sz w:val="14"/>
+              </w:rPr>
+              <w:t>DatabaseIntegrityFinding</w:t>
+            </w:r>
+          </w:p>
+        </w:tc>
+        <w:tc>
+          <w:tcPr>
+            <w:tcW w:type="dxa" w:w="2858"/>
+          </w:tcPr>
+          <w:p>
+            <w:r/>
+            <w:r>
+              <w:rPr>
+                <w:b w:val="0"/>
+                <w:sz w:val="14"/>
+              </w:rPr>
+              <w:t>CATEGORY_OR_GROUP_BIND</w:t>
+            </w:r>
+          </w:p>
+        </w:tc>
+        <w:tc>
+          <w:tcPr>
+            <w:tcW w:type="dxa" w:w="2858"/>
+          </w:tcPr>
+          <w:p>
+            <w:r/>
+            <w:r>
+              <w:rPr>
+                <w:b w:val="0"/>
+                <w:sz w:val="14"/>
+              </w:rPr>
+              <w:t>NOT_APPLICABLE</w:t>
+            </w:r>
+          </w:p>
+        </w:tc>
+        <w:tc>
+          <w:tcPr>
+            <w:tcW w:type="dxa" w:w="2858"/>
+          </w:tcPr>
+          <w:p>
+            <w:r/>
+            <w:r>
+              <w:rPr>
+                <w:b w:val="0"/>
+                <w:sz w:val="14"/>
+              </w:rPr>
+              <w:t>Current exact tree b2f81b20322dd9e9268001126b07931b437e27df: zero entity-bound operation evidence for this entity/operation. Mother §71 forbids speculative CRUD/sibling-feature expansion; current revision authorizes no new behavior.</w:t>
+            </w:r>
+          </w:p>
+        </w:tc>
+      </w:tr>
+      <w:tr>
+        <w:tc>
+          <w:tcPr>
+            <w:tcW w:type="dxa" w:w="2858"/>
+          </w:tcPr>
+          <w:p>
+            <w:r/>
+            <w:r>
+              <w:rPr>
+                <w:b w:val="0"/>
+                <w:sz w:val="14"/>
+              </w:rPr>
+              <w:t>DatabaseIntegrityFinding</w:t>
+            </w:r>
+          </w:p>
+        </w:tc>
+        <w:tc>
+          <w:tcPr>
+            <w:tcW w:type="dxa" w:w="2858"/>
+          </w:tcPr>
+          <w:p>
+            <w:r/>
+            <w:r>
+              <w:rPr>
+                <w:b w:val="0"/>
+                <w:sz w:val="14"/>
+              </w:rPr>
+              <w:t>CONFIRM_OR_APPROVE</w:t>
+            </w:r>
+          </w:p>
+        </w:tc>
+        <w:tc>
+          <w:tcPr>
+            <w:tcW w:type="dxa" w:w="2858"/>
+          </w:tcPr>
+          <w:p>
+            <w:r/>
+            <w:r>
+              <w:rPr>
+                <w:b w:val="0"/>
+                <w:sz w:val="14"/>
+              </w:rPr>
+              <w:t>NOT_APPLICABLE</w:t>
+            </w:r>
+          </w:p>
+        </w:tc>
+        <w:tc>
+          <w:tcPr>
+            <w:tcW w:type="dxa" w:w="2858"/>
+          </w:tcPr>
+          <w:p>
+            <w:r/>
+            <w:r>
+              <w:rPr>
+                <w:b w:val="0"/>
+                <w:sz w:val="14"/>
+              </w:rPr>
+              <w:t>Current exact tree b2f81b20322dd9e9268001126b07931b437e27df: zero entity-bound operation evidence for this entity/operation. Mother §71 forbids speculative CRUD/sibling-feature expansion; current revision authorizes no new behavior.</w:t>
+            </w:r>
+          </w:p>
+        </w:tc>
+      </w:tr>
+      <w:tr>
+        <w:tc>
+          <w:tcPr>
+            <w:tcW w:type="dxa" w:w="2858"/>
+          </w:tcPr>
+          <w:p>
+            <w:r/>
+            <w:r>
+              <w:rPr>
+                <w:b w:val="0"/>
+                <w:sz w:val="14"/>
+              </w:rPr>
+              <w:t>DatabaseIntegrityFinding</w:t>
+            </w:r>
+          </w:p>
+        </w:tc>
+        <w:tc>
+          <w:tcPr>
+            <w:tcW w:type="dxa" w:w="2858"/>
+          </w:tcPr>
+          <w:p>
+            <w:r/>
+            <w:r>
+              <w:rPr>
+                <w:b w:val="0"/>
+                <w:sz w:val="14"/>
+              </w:rPr>
+              <w:t>CREATE</w:t>
+            </w:r>
+          </w:p>
+        </w:tc>
+        <w:tc>
+          <w:tcPr>
+            <w:tcW w:type="dxa" w:w="2858"/>
+          </w:tcPr>
+          <w:p>
+            <w:r/>
+            <w:r>
+              <w:rPr>
+                <w:b w:val="0"/>
+                <w:sz w:val="14"/>
+              </w:rPr>
+              <w:t>NOT_APPLICABLE</w:t>
+            </w:r>
+          </w:p>
+        </w:tc>
+        <w:tc>
+          <w:tcPr>
+            <w:tcW w:type="dxa" w:w="2858"/>
+          </w:tcPr>
+          <w:p>
+            <w:r/>
+            <w:r>
+              <w:rPr>
+                <w:b w:val="0"/>
+                <w:sz w:val="14"/>
+              </w:rPr>
+              <w:t>Current exact tree b2f81b20322dd9e9268001126b07931b437e27df: zero entity-bound operation evidence for this entity/operation. Mother §71 forbids speculative CRUD/sibling-feature expansion; current revision authorizes no new behavior.</w:t>
+            </w:r>
+          </w:p>
+        </w:tc>
+      </w:tr>
+      <w:tr>
+        <w:tc>
+          <w:tcPr>
+            <w:tcW w:type="dxa" w:w="2858"/>
+          </w:tcPr>
+          <w:p>
+            <w:r/>
+            <w:r>
+              <w:rPr>
+                <w:b w:val="0"/>
+                <w:sz w:val="14"/>
+              </w:rPr>
+              <w:t>DatabaseIntegrityFinding</w:t>
+            </w:r>
+          </w:p>
+        </w:tc>
+        <w:tc>
+          <w:tcPr>
+            <w:tcW w:type="dxa" w:w="2858"/>
+          </w:tcPr>
+          <w:p>
+            <w:r/>
+            <w:r>
+              <w:rPr>
+                <w:b w:val="0"/>
+                <w:sz w:val="14"/>
+              </w:rPr>
+              <w:t>CREATION_MODE</w:t>
+            </w:r>
+          </w:p>
+        </w:tc>
+        <w:tc>
+          <w:tcPr>
+            <w:tcW w:type="dxa" w:w="2858"/>
+          </w:tcPr>
+          <w:p>
+            <w:r/>
+            <w:r>
+              <w:rPr>
+                <w:b w:val="0"/>
+                <w:sz w:val="14"/>
+              </w:rPr>
+              <w:t>NOT_APPLICABLE</w:t>
+            </w:r>
+          </w:p>
+        </w:tc>
+        <w:tc>
+          <w:tcPr>
+            <w:tcW w:type="dxa" w:w="2858"/>
+          </w:tcPr>
+          <w:p>
+            <w:r/>
+            <w:r>
+              <w:rPr>
+                <w:b w:val="0"/>
+                <w:sz w:val="14"/>
+              </w:rPr>
+              <w:t>Current exact tree b2f81b20322dd9e9268001126b07931b437e27df: zero entity-bound operation evidence for this entity/operation. Mother §71 forbids speculative CRUD/sibling-feature expansion; current revision authorizes no new behavior.</w:t>
+            </w:r>
+          </w:p>
+        </w:tc>
+      </w:tr>
+      <w:tr>
+        <w:tc>
+          <w:tcPr>
+            <w:tcW w:type="dxa" w:w="2858"/>
+          </w:tcPr>
+          <w:p>
+            <w:r/>
+            <w:r>
+              <w:rPr>
+                <w:b w:val="0"/>
+                <w:sz w:val="14"/>
+              </w:rPr>
+              <w:t>DatabaseIntegrityFinding</w:t>
+            </w:r>
+          </w:p>
+        </w:tc>
+        <w:tc>
+          <w:tcPr>
+            <w:tcW w:type="dxa" w:w="2858"/>
+          </w:tcPr>
+          <w:p>
+            <w:r/>
+            <w:r>
+              <w:rPr>
+                <w:b w:val="0"/>
+                <w:sz w:val="14"/>
+              </w:rPr>
+              <w:t>DEPENDENCY_IMPACT</w:t>
+            </w:r>
+          </w:p>
+        </w:tc>
+        <w:tc>
+          <w:tcPr>
+            <w:tcW w:type="dxa" w:w="2858"/>
+          </w:tcPr>
+          <w:p>
+            <w:r/>
+            <w:r>
+              <w:rPr>
+                <w:b w:val="0"/>
+                <w:sz w:val="14"/>
+              </w:rPr>
+              <w:t>NOT_APPLICABLE</w:t>
+            </w:r>
+          </w:p>
+        </w:tc>
+        <w:tc>
+          <w:tcPr>
+            <w:tcW w:type="dxa" w:w="2858"/>
+          </w:tcPr>
+          <w:p>
+            <w:r/>
+            <w:r>
+              <w:rPr>
+                <w:b w:val="0"/>
+                <w:sz w:val="14"/>
+              </w:rPr>
+              <w:t>Current exact tree b2f81b20322dd9e9268001126b07931b437e27df: zero entity-bound operation evidence for this entity/operation. Mother §71 forbids speculative CRUD/sibling-feature expansion; current revision authorizes no new behavior.</w:t>
+            </w:r>
+          </w:p>
+        </w:tc>
+      </w:tr>
+      <w:tr>
+        <w:tc>
+          <w:tcPr>
+            <w:tcW w:type="dxa" w:w="2858"/>
+          </w:tcPr>
+          <w:p>
+            <w:r/>
+            <w:r>
+              <w:rPr>
+                <w:b w:val="0"/>
+                <w:sz w:val="14"/>
+              </w:rPr>
+              <w:t>DatabaseIntegrityFinding</w:t>
+            </w:r>
+          </w:p>
+        </w:tc>
+        <w:tc>
+          <w:tcPr>
+            <w:tcW w:type="dxa" w:w="2858"/>
+          </w:tcPr>
+          <w:p>
+            <w:r/>
+            <w:r>
+              <w:rPr>
+                <w:b w:val="0"/>
+                <w:sz w:val="14"/>
+              </w:rPr>
+              <w:t>DISCOVER_OR_LIST</w:t>
+            </w:r>
+          </w:p>
+        </w:tc>
+        <w:tc>
+          <w:tcPr>
+            <w:tcW w:type="dxa" w:w="2858"/>
+          </w:tcPr>
+          <w:p>
+            <w:r/>
+            <w:r>
+              <w:rPr>
+                <w:b w:val="0"/>
+                <w:sz w:val="14"/>
+              </w:rPr>
+              <w:t>NOT_APPLICABLE</w:t>
+            </w:r>
+          </w:p>
+        </w:tc>
+        <w:tc>
+          <w:tcPr>
+            <w:tcW w:type="dxa" w:w="2858"/>
+          </w:tcPr>
+          <w:p>
+            <w:r/>
+            <w:r>
+              <w:rPr>
+                <w:b w:val="0"/>
+                <w:sz w:val="14"/>
+              </w:rPr>
+              <w:t>Current exact tree b2f81b20322dd9e9268001126b07931b437e27df: zero entity-bound operation evidence for this entity/operation. Mother §71 forbids speculative CRUD/sibling-feature expansion; current revision authorizes no new behavior.</w:t>
+            </w:r>
+          </w:p>
+        </w:tc>
+      </w:tr>
+      <w:tr>
+        <w:tc>
+          <w:tcPr>
+            <w:tcW w:type="dxa" w:w="2858"/>
+          </w:tcPr>
+          <w:p>
+            <w:r/>
+            <w:r>
+              <w:rPr>
+                <w:b w:val="0"/>
+                <w:sz w:val="14"/>
+              </w:rPr>
+              <w:t>DatabaseIntegrityFinding</w:t>
+            </w:r>
+          </w:p>
+        </w:tc>
+        <w:tc>
+          <w:tcPr>
+            <w:tcW w:type="dxa" w:w="2858"/>
+          </w:tcPr>
+          <w:p>
+            <w:r/>
+            <w:r>
+              <w:rPr>
+                <w:b w:val="0"/>
+                <w:sz w:val="14"/>
+              </w:rPr>
+              <w:t>DRAFT</w:t>
+            </w:r>
+          </w:p>
+        </w:tc>
+        <w:tc>
+          <w:tcPr>
+            <w:tcW w:type="dxa" w:w="2858"/>
+          </w:tcPr>
+          <w:p>
+            <w:r/>
+            <w:r>
+              <w:rPr>
+                <w:b w:val="0"/>
+                <w:sz w:val="14"/>
+              </w:rPr>
+              <w:t>NOT_APPLICABLE</w:t>
+            </w:r>
+          </w:p>
+        </w:tc>
+        <w:tc>
+          <w:tcPr>
+            <w:tcW w:type="dxa" w:w="2858"/>
+          </w:tcPr>
+          <w:p>
+            <w:r/>
+            <w:r>
+              <w:rPr>
+                <w:b w:val="0"/>
+                <w:sz w:val="14"/>
+              </w:rPr>
+              <w:t>Current exact tree b2f81b20322dd9e9268001126b07931b437e27df: zero entity-bound operation evidence for this entity/operation. Mother §71 forbids speculative CRUD/sibling-feature expansion; current revision authorizes no new behavior.</w:t>
+            </w:r>
+          </w:p>
+        </w:tc>
+      </w:tr>
+      <w:tr>
+        <w:tc>
+          <w:tcPr>
+            <w:tcW w:type="dxa" w:w="2858"/>
+          </w:tcPr>
+          <w:p>
+            <w:r/>
+            <w:r>
+              <w:rPr>
+                <w:b w:val="0"/>
+                <w:sz w:val="14"/>
+              </w:rPr>
+              <w:t>DatabaseIntegrityFinding</w:t>
+            </w:r>
+          </w:p>
+        </w:tc>
+        <w:tc>
+          <w:tcPr>
+            <w:tcW w:type="dxa" w:w="2858"/>
+          </w:tcPr>
+          <w:p>
+            <w:r/>
+            <w:r>
+              <w:rPr>
+                <w:b w:val="0"/>
+                <w:sz w:val="14"/>
+              </w:rPr>
+              <w:t>EDIT</w:t>
+            </w:r>
+          </w:p>
+        </w:tc>
+        <w:tc>
+          <w:tcPr>
+            <w:tcW w:type="dxa" w:w="2858"/>
+          </w:tcPr>
+          <w:p>
+            <w:r/>
+            <w:r>
+              <w:rPr>
+                <w:b w:val="0"/>
+                <w:sz w:val="14"/>
+              </w:rPr>
+              <w:t>NOT_APPLICABLE</w:t>
+            </w:r>
+          </w:p>
+        </w:tc>
+        <w:tc>
+          <w:tcPr>
+            <w:tcW w:type="dxa" w:w="2858"/>
+          </w:tcPr>
+          <w:p>
+            <w:r/>
+            <w:r>
+              <w:rPr>
+                <w:b w:val="0"/>
+                <w:sz w:val="14"/>
+              </w:rPr>
+              <w:t>Current exact tree b2f81b20322dd9e9268001126b07931b437e27df: zero entity-bound operation evidence for this entity/operation. Mother §71 forbids speculative CRUD/sibling-feature expansion; current revision authorizes no new behavior.</w:t>
+            </w:r>
+          </w:p>
+        </w:tc>
+      </w:tr>
+      <w:tr>
+        <w:tc>
+          <w:tcPr>
+            <w:tcW w:type="dxa" w:w="2858"/>
+          </w:tcPr>
+          <w:p>
+            <w:r/>
+            <w:r>
+              <w:rPr>
+                <w:b w:val="0"/>
+                <w:sz w:val="14"/>
+              </w:rPr>
+              <w:t>DatabaseIntegrityFinding</w:t>
+            </w:r>
+          </w:p>
+        </w:tc>
+        <w:tc>
+          <w:tcPr>
+            <w:tcW w:type="dxa" w:w="2858"/>
+          </w:tcPr>
+          <w:p>
+            <w:r/>
+            <w:r>
+              <w:rPr>
+                <w:b w:val="0"/>
+                <w:sz w:val="14"/>
+              </w:rPr>
+              <w:t>ERROR_RECOVERY</w:t>
+            </w:r>
+          </w:p>
+        </w:tc>
+        <w:tc>
+          <w:tcPr>
+            <w:tcW w:type="dxa" w:w="2858"/>
+          </w:tcPr>
+          <w:p>
+            <w:r/>
+            <w:r>
+              <w:rPr>
+                <w:b w:val="0"/>
+                <w:sz w:val="14"/>
+              </w:rPr>
+              <w:t>NOT_APPLICABLE</w:t>
+            </w:r>
+          </w:p>
+        </w:tc>
+        <w:tc>
+          <w:tcPr>
+            <w:tcW w:type="dxa" w:w="2858"/>
+          </w:tcPr>
+          <w:p>
+            <w:r/>
+            <w:r>
+              <w:rPr>
+                <w:b w:val="0"/>
+                <w:sz w:val="14"/>
+              </w:rPr>
+              <w:t>Current exact tree b2f81b20322dd9e9268001126b07931b437e27df: zero entity-bound operation evidence for this entity/operation. Mother §71 forbids speculative CRUD/sibling-feature expansion; current revision authorizes no new behavior.</w:t>
+            </w:r>
+          </w:p>
+        </w:tc>
+      </w:tr>
+      <w:tr>
+        <w:tc>
+          <w:tcPr>
+            <w:tcW w:type="dxa" w:w="2858"/>
+          </w:tcPr>
+          <w:p>
+            <w:r/>
+            <w:r>
+              <w:rPr>
+                <w:b w:val="0"/>
+                <w:sz w:val="14"/>
+              </w:rPr>
+              <w:t>DatabaseIntegrityFinding</w:t>
+            </w:r>
+          </w:p>
+        </w:tc>
+        <w:tc>
+          <w:tcPr>
+            <w:tcW w:type="dxa" w:w="2858"/>
+          </w:tcPr>
+          <w:p>
+            <w:r/>
+            <w:r>
+              <w:rPr>
+                <w:b w:val="0"/>
+                <w:sz w:val="14"/>
+              </w:rPr>
+              <w:t>LOCK_OR_UNLOCK</w:t>
+            </w:r>
+          </w:p>
+        </w:tc>
+        <w:tc>
+          <w:tcPr>
+            <w:tcW w:type="dxa" w:w="2858"/>
+          </w:tcPr>
+          <w:p>
+            <w:r/>
+            <w:r>
+              <w:rPr>
+                <w:b w:val="0"/>
+                <w:sz w:val="14"/>
+              </w:rPr>
+              <w:t>NOT_APPLICABLE</w:t>
+            </w:r>
+          </w:p>
+        </w:tc>
+        <w:tc>
+          <w:tcPr>
+            <w:tcW w:type="dxa" w:w="2858"/>
+          </w:tcPr>
+          <w:p>
+            <w:r/>
+            <w:r>
+              <w:rPr>
+                <w:b w:val="0"/>
+                <w:sz w:val="14"/>
+              </w:rPr>
+              <w:t>Current exact tree b2f81b20322dd9e9268001126b07931b437e27df: zero entity-bound operation evidence for this entity/operation. Mother §71 forbids speculative CRUD/sibling-feature expansion; current revision authorizes no new behavior.</w:t>
+            </w:r>
+          </w:p>
+        </w:tc>
+      </w:tr>
+      <w:tr>
+        <w:tc>
+          <w:tcPr>
+            <w:tcW w:type="dxa" w:w="2858"/>
+          </w:tcPr>
+          <w:p>
+            <w:r/>
+            <w:r>
+              <w:rPr>
+                <w:b w:val="0"/>
+                <w:sz w:val="14"/>
+              </w:rPr>
+              <w:t>DatabaseIntegrityFinding</w:t>
+            </w:r>
+          </w:p>
+        </w:tc>
+        <w:tc>
+          <w:tcPr>
+            <w:tcW w:type="dxa" w:w="2858"/>
+          </w:tcPr>
+          <w:p>
+            <w:r/>
+            <w:r>
+              <w:rPr>
+                <w:b w:val="0"/>
+                <w:sz w:val="14"/>
+              </w:rPr>
+              <w:t>MOVE_OR_REPARENT</w:t>
+            </w:r>
+          </w:p>
+        </w:tc>
+        <w:tc>
+          <w:tcPr>
+            <w:tcW w:type="dxa" w:w="2858"/>
+          </w:tcPr>
+          <w:p>
+            <w:r/>
+            <w:r>
+              <w:rPr>
+                <w:b w:val="0"/>
+                <w:sz w:val="14"/>
+              </w:rPr>
+              <w:t>NOT_APPLICABLE</w:t>
+            </w:r>
+          </w:p>
+        </w:tc>
+        <w:tc>
+          <w:tcPr>
+            <w:tcW w:type="dxa" w:w="2858"/>
+          </w:tcPr>
+          <w:p>
+            <w:r/>
+            <w:r>
+              <w:rPr>
+                <w:b w:val="0"/>
+                <w:sz w:val="14"/>
+              </w:rPr>
+              <w:t>Current exact tree b2f81b20322dd9e9268001126b07931b437e27df: zero entity-bound operation evidence for this entity/operation. Mother §71 forbids speculative CRUD/sibling-feature expansion; current revision authorizes no new behavior.</w:t>
+            </w:r>
+          </w:p>
+        </w:tc>
+      </w:tr>
+      <w:tr>
+        <w:tc>
+          <w:tcPr>
+            <w:tcW w:type="dxa" w:w="2858"/>
+          </w:tcPr>
+          <w:p>
+            <w:r/>
+            <w:r>
+              <w:rPr>
+                <w:b w:val="0"/>
+                <w:sz w:val="14"/>
+              </w:rPr>
+              <w:t>DatabaseIntegrityFinding</w:t>
+            </w:r>
+          </w:p>
+        </w:tc>
+        <w:tc>
+          <w:tcPr>
+            <w:tcW w:type="dxa" w:w="2858"/>
+          </w:tcPr>
+          <w:p>
+            <w:r/>
+            <w:r>
+              <w:rPr>
+                <w:b w:val="0"/>
+                <w:sz w:val="14"/>
+              </w:rPr>
+              <w:t>NEXT_STEP</w:t>
+            </w:r>
+          </w:p>
+        </w:tc>
+        <w:tc>
+          <w:tcPr>
+            <w:tcW w:type="dxa" w:w="2858"/>
+          </w:tcPr>
+          <w:p>
+            <w:r/>
+            <w:r>
+              <w:rPr>
+                <w:b w:val="0"/>
+                <w:sz w:val="14"/>
+              </w:rPr>
+              <w:t>NOT_APPLICABLE</w:t>
+            </w:r>
+          </w:p>
+        </w:tc>
+        <w:tc>
+          <w:tcPr>
+            <w:tcW w:type="dxa" w:w="2858"/>
+          </w:tcPr>
+          <w:p>
+            <w:r/>
+            <w:r>
+              <w:rPr>
+                <w:b w:val="0"/>
+                <w:sz w:val="14"/>
+              </w:rPr>
+              <w:t>Current exact tree b2f81b20322dd9e9268001126b07931b437e27df: zero entity-bound operation evidence for this entity/operation. Mother §71 forbids speculative CRUD/sibling-feature expansion; current revision authorizes no new behavior.</w:t>
+            </w:r>
+          </w:p>
+        </w:tc>
+      </w:tr>
+      <w:tr>
+        <w:tc>
+          <w:tcPr>
+            <w:tcW w:type="dxa" w:w="2858"/>
+          </w:tcPr>
+          <w:p>
+            <w:r/>
+            <w:r>
+              <w:rPr>
+                <w:b w:val="0"/>
+                <w:sz w:val="14"/>
+              </w:rPr>
+              <w:t>DatabaseIntegrityFinding</w:t>
+            </w:r>
+          </w:p>
+        </w:tc>
+        <w:tc>
+          <w:tcPr>
+            <w:tcW w:type="dxa" w:w="2858"/>
+          </w:tcPr>
+          <w:p>
+            <w:r/>
+            <w:r>
+              <w:rPr>
+                <w:b w:val="0"/>
+                <w:sz w:val="14"/>
+              </w:rPr>
+              <w:t>PARENT_BIND</w:t>
+            </w:r>
+          </w:p>
+        </w:tc>
+        <w:tc>
+          <w:tcPr>
+            <w:tcW w:type="dxa" w:w="2858"/>
+          </w:tcPr>
+          <w:p>
+            <w:r/>
+            <w:r>
+              <w:rPr>
+                <w:b w:val="0"/>
+                <w:sz w:val="14"/>
+              </w:rPr>
+              <w:t>NOT_APPLICABLE</w:t>
+            </w:r>
+          </w:p>
+        </w:tc>
+        <w:tc>
+          <w:tcPr>
+            <w:tcW w:type="dxa" w:w="2858"/>
+          </w:tcPr>
+          <w:p>
+            <w:r/>
+            <w:r>
+              <w:rPr>
+                <w:b w:val="0"/>
+                <w:sz w:val="14"/>
+              </w:rPr>
+              <w:t>Current exact tree b2f81b20322dd9e9268001126b07931b437e27df: zero entity-bound operation evidence for this entity/operation. Mother §71 forbids speculative CRUD/sibling-feature expansion; current revision authorizes no new behavior.</w:t>
+            </w:r>
+          </w:p>
+        </w:tc>
+      </w:tr>
+      <w:tr>
+        <w:tc>
+          <w:tcPr>
+            <w:tcW w:type="dxa" w:w="2858"/>
+          </w:tcPr>
+          <w:p>
+            <w:r/>
+            <w:r>
+              <w:rPr>
+                <w:b w:val="0"/>
+                <w:sz w:val="14"/>
+              </w:rPr>
+              <w:t>DatabaseIntegrityFinding</w:t>
+            </w:r>
+          </w:p>
+        </w:tc>
+        <w:tc>
+          <w:tcPr>
+            <w:tcW w:type="dxa" w:w="2858"/>
+          </w:tcPr>
+          <w:p>
+            <w:r/>
+            <w:r>
+              <w:rPr>
+                <w:b w:val="0"/>
+                <w:sz w:val="14"/>
+              </w:rPr>
+              <w:t>REORDER</w:t>
+            </w:r>
+          </w:p>
+        </w:tc>
+        <w:tc>
+          <w:tcPr>
+            <w:tcW w:type="dxa" w:w="2858"/>
+          </w:tcPr>
+          <w:p>
+            <w:r/>
+            <w:r>
+              <w:rPr>
+                <w:b w:val="0"/>
+                <w:sz w:val="14"/>
+              </w:rPr>
+              <w:t>NOT_APPLICABLE</w:t>
+            </w:r>
+          </w:p>
+        </w:tc>
+        <w:tc>
+          <w:tcPr>
+            <w:tcW w:type="dxa" w:w="2858"/>
+          </w:tcPr>
+          <w:p>
+            <w:r/>
+            <w:r>
+              <w:rPr>
+                <w:b w:val="0"/>
+                <w:sz w:val="14"/>
+              </w:rPr>
+              <w:t>Current exact tree b2f81b20322dd9e9268001126b07931b437e27df: zero entity-bound operation evidence for this entity/operation. Mother §71 forbids speculative CRUD/sibling-feature expansion; current revision authorizes no new behavior.</w:t>
+            </w:r>
+          </w:p>
+        </w:tc>
+      </w:tr>
+      <w:tr>
+        <w:tc>
+          <w:tcPr>
+            <w:tcW w:type="dxa" w:w="2858"/>
+          </w:tcPr>
+          <w:p>
+            <w:r/>
+            <w:r>
+              <w:rPr>
+                <w:b w:val="0"/>
+                <w:sz w:val="14"/>
+              </w:rPr>
+              <w:t>DatabaseIntegrityFinding</w:t>
+            </w:r>
+          </w:p>
+        </w:tc>
+        <w:tc>
+          <w:tcPr>
+            <w:tcW w:type="dxa" w:w="2858"/>
+          </w:tcPr>
+          <w:p>
+            <w:r/>
+            <w:r>
+              <w:rPr>
+                <w:b w:val="0"/>
+                <w:sz w:val="14"/>
+              </w:rPr>
+              <w:t>RESTORE</w:t>
+            </w:r>
+          </w:p>
+        </w:tc>
+        <w:tc>
+          <w:tcPr>
+            <w:tcW w:type="dxa" w:w="2858"/>
+          </w:tcPr>
+          <w:p>
+            <w:r/>
+            <w:r>
+              <w:rPr>
+                <w:b w:val="0"/>
+                <w:sz w:val="14"/>
+              </w:rPr>
+              <w:t>NOT_APPLICABLE</w:t>
+            </w:r>
+          </w:p>
+        </w:tc>
+        <w:tc>
+          <w:tcPr>
+            <w:tcW w:type="dxa" w:w="2858"/>
+          </w:tcPr>
+          <w:p>
+            <w:r/>
+            <w:r>
+              <w:rPr>
+                <w:b w:val="0"/>
+                <w:sz w:val="14"/>
+              </w:rPr>
+              <w:t>Current exact tree b2f81b20322dd9e9268001126b07931b437e27df: zero entity-bound operation evidence for this entity/operation. Mother §71 forbids speculative CRUD/sibling-feature expansion; current revision authorizes no new behavior.</w:t>
+            </w:r>
+          </w:p>
+        </w:tc>
+      </w:tr>
+      <w:tr>
+        <w:tc>
+          <w:tcPr>
+            <w:tcW w:type="dxa" w:w="2858"/>
+          </w:tcPr>
+          <w:p>
+            <w:r/>
+            <w:r>
+              <w:rPr>
+                <w:b w:val="0"/>
+                <w:sz w:val="14"/>
+              </w:rPr>
+              <w:t>DatabaseIntegrityFinding</w:t>
+            </w:r>
+          </w:p>
+        </w:tc>
+        <w:tc>
+          <w:tcPr>
+            <w:tcW w:type="dxa" w:w="2858"/>
+          </w:tcPr>
+          <w:p>
+            <w:r/>
+            <w:r>
+              <w:rPr>
+                <w:b w:val="0"/>
+                <w:sz w:val="14"/>
+              </w:rPr>
+              <w:t>RESUME</w:t>
+            </w:r>
+          </w:p>
+        </w:tc>
+        <w:tc>
+          <w:tcPr>
+            <w:tcW w:type="dxa" w:w="2858"/>
+          </w:tcPr>
+          <w:p>
+            <w:r/>
+            <w:r>
+              <w:rPr>
+                <w:b w:val="0"/>
+                <w:sz w:val="14"/>
+              </w:rPr>
+              <w:t>NOT_APPLICABLE</w:t>
+            </w:r>
+          </w:p>
+        </w:tc>
+        <w:tc>
+          <w:tcPr>
+            <w:tcW w:type="dxa" w:w="2858"/>
+          </w:tcPr>
+          <w:p>
+            <w:r/>
+            <w:r>
+              <w:rPr>
+                <w:b w:val="0"/>
+                <w:sz w:val="14"/>
+              </w:rPr>
+              <w:t>Current exact tree b2f81b20322dd9e9268001126b07931b437e27df: zero entity-bound operation evidence for this entity/operation. Mother §71 forbids speculative CRUD/sibling-feature expansion; current revision authorizes no new behavior.</w:t>
+            </w:r>
+          </w:p>
+        </w:tc>
+      </w:tr>
+      <w:tr>
+        <w:tc>
+          <w:tcPr>
+            <w:tcW w:type="dxa" w:w="2858"/>
+          </w:tcPr>
+          <w:p>
+            <w:r/>
+            <w:r>
+              <w:rPr>
+                <w:b w:val="0"/>
+                <w:sz w:val="14"/>
+              </w:rPr>
+              <w:t>DatabaseIntegrityFinding</w:t>
+            </w:r>
+          </w:p>
+        </w:tc>
+        <w:tc>
+          <w:tcPr>
+            <w:tcW w:type="dxa" w:w="2858"/>
+          </w:tcPr>
+          <w:p>
+            <w:r/>
+            <w:r>
+              <w:rPr>
+                <w:b w:val="0"/>
+                <w:sz w:val="14"/>
+              </w:rPr>
+              <w:t>REVISE</w:t>
+            </w:r>
+          </w:p>
+        </w:tc>
+        <w:tc>
+          <w:tcPr>
+            <w:tcW w:type="dxa" w:w="2858"/>
+          </w:tcPr>
+          <w:p>
+            <w:r/>
+            <w:r>
+              <w:rPr>
+                <w:b w:val="0"/>
+                <w:sz w:val="14"/>
+              </w:rPr>
+              <w:t>NOT_APPLICABLE</w:t>
+            </w:r>
+          </w:p>
+        </w:tc>
+        <w:tc>
+          <w:tcPr>
+            <w:tcW w:type="dxa" w:w="2858"/>
+          </w:tcPr>
+          <w:p>
+            <w:r/>
+            <w:r>
+              <w:rPr>
+                <w:b w:val="0"/>
+                <w:sz w:val="14"/>
+              </w:rPr>
+              <w:t>Current exact tree b2f81b20322dd9e9268001126b07931b437e27df: zero entity-bound operation evidence for this entity/operation. Mother §71 forbids speculative CRUD/sibling-feature expansion; current revision authorizes no new behavior.</w:t>
+            </w:r>
+          </w:p>
+        </w:tc>
+      </w:tr>
+      <w:tr>
+        <w:tc>
+          <w:tcPr>
+            <w:tcW w:type="dxa" w:w="2858"/>
+          </w:tcPr>
+          <w:p>
+            <w:r/>
+            <w:r>
+              <w:rPr>
+                <w:b w:val="0"/>
+                <w:sz w:val="14"/>
+              </w:rPr>
+              <w:t>DatabaseIntegrityFinding</w:t>
+            </w:r>
+          </w:p>
+        </w:tc>
+        <w:tc>
+          <w:tcPr>
+            <w:tcW w:type="dxa" w:w="2858"/>
+          </w:tcPr>
+          <w:p>
+            <w:r/>
+            <w:r>
+              <w:rPr>
+                <w:b w:val="0"/>
+                <w:sz w:val="14"/>
+              </w:rPr>
+              <w:t>SAVE</w:t>
+            </w:r>
+          </w:p>
+        </w:tc>
+        <w:tc>
+          <w:tcPr>
+            <w:tcW w:type="dxa" w:w="2858"/>
+          </w:tcPr>
+          <w:p>
+            <w:r/>
+            <w:r>
+              <w:rPr>
+                <w:b w:val="0"/>
+                <w:sz w:val="14"/>
+              </w:rPr>
+              <w:t>NOT_APPLICABLE</w:t>
+            </w:r>
+          </w:p>
+        </w:tc>
+        <w:tc>
+          <w:tcPr>
+            <w:tcW w:type="dxa" w:w="2858"/>
+          </w:tcPr>
+          <w:p>
+            <w:r/>
+            <w:r>
+              <w:rPr>
+                <w:b w:val="0"/>
+                <w:sz w:val="14"/>
+              </w:rPr>
+              <w:t>Current exact tree b2f81b20322dd9e9268001126b07931b437e27df: zero entity-bound operation evidence for this entity/operation. Mother §71 forbids speculative CRUD/sibling-feature expansion; current revision authorizes no new behavior.</w:t>
+            </w:r>
+          </w:p>
+        </w:tc>
+      </w:tr>
+      <w:tr>
+        <w:tc>
+          <w:tcPr>
+            <w:tcW w:type="dxa" w:w="2858"/>
+          </w:tcPr>
+          <w:p>
+            <w:r/>
+            <w:r>
+              <w:rPr>
+                <w:b w:val="0"/>
+                <w:sz w:val="14"/>
+              </w:rPr>
+              <w:t>DatabaseIntegrityFinding</w:t>
+            </w:r>
+          </w:p>
+        </w:tc>
+        <w:tc>
+          <w:tcPr>
+            <w:tcW w:type="dxa" w:w="2858"/>
+          </w:tcPr>
+          <w:p>
+            <w:r/>
+            <w:r>
+              <w:rPr>
+                <w:b w:val="0"/>
+                <w:sz w:val="14"/>
+              </w:rPr>
+              <w:t>SELECT_OR_OPEN</w:t>
+            </w:r>
+          </w:p>
+        </w:tc>
+        <w:tc>
+          <w:tcPr>
+            <w:tcW w:type="dxa" w:w="2858"/>
+          </w:tcPr>
+          <w:p>
+            <w:r/>
+            <w:r>
+              <w:rPr>
+                <w:b w:val="0"/>
+                <w:sz w:val="14"/>
+              </w:rPr>
+              <w:t>NOT_APPLICABLE</w:t>
+            </w:r>
+          </w:p>
+        </w:tc>
+        <w:tc>
+          <w:tcPr>
+            <w:tcW w:type="dxa" w:w="2858"/>
+          </w:tcPr>
+          <w:p>
+            <w:r/>
+            <w:r>
+              <w:rPr>
+                <w:b w:val="0"/>
+                <w:sz w:val="14"/>
+              </w:rPr>
+              <w:t>Current exact tree b2f81b20322dd9e9268001126b07931b437e27df: zero entity-bound operation evidence for this entity/operation. Mother §71 forbids speculative CRUD/sibling-feature expansion; current revision authorizes no new behavior.</w:t>
+            </w:r>
+          </w:p>
+        </w:tc>
+      </w:tr>
+      <w:tr>
+        <w:tc>
+          <w:tcPr>
+            <w:tcW w:type="dxa" w:w="2858"/>
+          </w:tcPr>
+          <w:p>
+            <w:r/>
+            <w:r>
+              <w:rPr>
+                <w:b w:val="0"/>
+                <w:sz w:val="14"/>
+              </w:rPr>
+              <w:t>DatabaseIntegrityFinding</w:t>
+            </w:r>
+          </w:p>
+        </w:tc>
+        <w:tc>
+          <w:tcPr>
+            <w:tcW w:type="dxa" w:w="2858"/>
+          </w:tcPr>
+          <w:p>
+            <w:r/>
+            <w:r>
+              <w:rPr>
+                <w:b w:val="0"/>
+                <w:sz w:val="14"/>
+              </w:rPr>
+              <w:t>VALIDATE</w:t>
+            </w:r>
+          </w:p>
+        </w:tc>
+        <w:tc>
+          <w:tcPr>
+            <w:tcW w:type="dxa" w:w="2858"/>
+          </w:tcPr>
+          <w:p>
+            <w:r/>
+            <w:r>
+              <w:rPr>
+                <w:b w:val="0"/>
+                <w:sz w:val="14"/>
+              </w:rPr>
+              <w:t>NOT_APPLICABLE</w:t>
+            </w:r>
+          </w:p>
+        </w:tc>
+        <w:tc>
+          <w:tcPr>
+            <w:tcW w:type="dxa" w:w="2858"/>
+          </w:tcPr>
+          <w:p>
+            <w:r/>
+            <w:r>
+              <w:rPr>
+                <w:b w:val="0"/>
+                <w:sz w:val="14"/>
+              </w:rPr>
+              <w:t>Current exact tree b2f81b20322dd9e9268001126b07931b437e27df: zero entity-bound operation evidence for this entity/operation. Mother §71 forbids speculative CRUD/sibling-feature expansion; current revision authorizes no new behavior.</w:t>
+            </w:r>
+          </w:p>
+        </w:tc>
+      </w:tr>
+      <w:tr>
+        <w:tc>
+          <w:tcPr>
+            <w:tcW w:type="dxa" w:w="2858"/>
+          </w:tcPr>
+          <w:p>
+            <w:r/>
+            <w:r>
+              <w:rPr>
+                <w:b w:val="0"/>
+                <w:sz w:val="14"/>
+              </w:rPr>
+              <w:t>DatabaseIntegrityFinding</w:t>
+            </w:r>
+          </w:p>
+        </w:tc>
+        <w:tc>
+          <w:tcPr>
+            <w:tcW w:type="dxa" w:w="2858"/>
+          </w:tcPr>
+          <w:p>
+            <w:r/>
+            <w:r>
+              <w:rPr>
+                <w:b w:val="0"/>
+                <w:sz w:val="14"/>
+              </w:rPr>
+              <w:t>VERSION</w:t>
+            </w:r>
+          </w:p>
+        </w:tc>
+        <w:tc>
+          <w:tcPr>
+            <w:tcW w:type="dxa" w:w="2858"/>
+          </w:tcPr>
+          <w:p>
+            <w:r/>
+            <w:r>
+              <w:rPr>
+                <w:b w:val="0"/>
+                <w:sz w:val="14"/>
+              </w:rPr>
+              <w:t>NOT_APPLICABLE</w:t>
+            </w:r>
+          </w:p>
+        </w:tc>
+        <w:tc>
+          <w:tcPr>
+            <w:tcW w:type="dxa" w:w="2858"/>
+          </w:tcPr>
+          <w:p>
+            <w:r/>
+            <w:r>
+              <w:rPr>
+                <w:b w:val="0"/>
+                <w:sz w:val="14"/>
+              </w:rPr>
+              <w:t>Current exact tree b2f81b20322dd9e9268001126b07931b437e27df: zero entity-bound operation evidence for this entity/operation. Mother §71 forbids speculative CRUD/sibling-feature expansion; current revision authorizes no new behavior.</w:t>
+            </w:r>
+          </w:p>
+        </w:tc>
+      </w:tr>
+      <w:tr>
+        <w:tc>
+          <w:tcPr>
+            <w:tcW w:type="dxa" w:w="2858"/>
+          </w:tcPr>
+          <w:p>
+            <w:r/>
+            <w:r>
+              <w:rPr>
+                <w:b w:val="0"/>
+                <w:sz w:val="14"/>
+              </w:rPr>
+              <w:t>SchemaMigrationHistory</w:t>
+            </w:r>
+          </w:p>
+        </w:tc>
+        <w:tc>
+          <w:tcPr>
+            <w:tcW w:type="dxa" w:w="2858"/>
+          </w:tcPr>
+          <w:p>
+            <w:r/>
+            <w:r>
+              <w:rPr>
+                <w:b w:val="0"/>
+                <w:sz w:val="14"/>
+              </w:rPr>
+              <w:t>ARCHIVE_OR_DELETE</w:t>
+            </w:r>
+          </w:p>
+        </w:tc>
+        <w:tc>
+          <w:tcPr>
+            <w:tcW w:type="dxa" w:w="2858"/>
+          </w:tcPr>
+          <w:p>
+            <w:r/>
+            <w:r>
+              <w:rPr>
+                <w:b w:val="0"/>
+                <w:sz w:val="14"/>
+              </w:rPr>
+              <w:t>NOT_APPLICABLE</w:t>
+            </w:r>
+          </w:p>
+        </w:tc>
+        <w:tc>
+          <w:tcPr>
+            <w:tcW w:type="dxa" w:w="2858"/>
+          </w:tcPr>
+          <w:p>
+            <w:r/>
+            <w:r>
+              <w:rPr>
+                <w:b w:val="0"/>
+                <w:sz w:val="14"/>
+              </w:rPr>
+              <w:t>Current exact tree b2f81b20322dd9e9268001126b07931b437e27df: zero entity-bound operation evidence for this entity/operation. Mother §71 forbids speculative CRUD/sibling-feature expansion; current revision authorizes no new behavior.</w:t>
+            </w:r>
+          </w:p>
+        </w:tc>
+      </w:tr>
+      <w:tr>
+        <w:tc>
+          <w:tcPr>
+            <w:tcW w:type="dxa" w:w="2858"/>
+          </w:tcPr>
+          <w:p>
+            <w:r/>
+            <w:r>
+              <w:rPr>
+                <w:b w:val="0"/>
+                <w:sz w:val="14"/>
+              </w:rPr>
+              <w:t>SchemaMigrationHistory</w:t>
+            </w:r>
+          </w:p>
+        </w:tc>
+        <w:tc>
+          <w:tcPr>
+            <w:tcW w:type="dxa" w:w="2858"/>
+          </w:tcPr>
+          <w:p>
+            <w:r/>
+            <w:r>
+              <w:rPr>
+                <w:b w:val="0"/>
+                <w:sz w:val="14"/>
+              </w:rPr>
+              <w:t>AUDIT</w:t>
+            </w:r>
+          </w:p>
+        </w:tc>
+        <w:tc>
+          <w:tcPr>
+            <w:tcW w:type="dxa" w:w="2858"/>
+          </w:tcPr>
+          <w:p>
+            <w:r/>
+            <w:r>
+              <w:rPr>
+                <w:b w:val="0"/>
+                <w:sz w:val="14"/>
+              </w:rPr>
+              <w:t>NOT_APPLICABLE</w:t>
+            </w:r>
+          </w:p>
+        </w:tc>
+        <w:tc>
+          <w:tcPr>
+            <w:tcW w:type="dxa" w:w="2858"/>
+          </w:tcPr>
+          <w:p>
+            <w:r/>
+            <w:r>
+              <w:rPr>
+                <w:b w:val="0"/>
+                <w:sz w:val="14"/>
+              </w:rPr>
+              <w:t>Current exact tree b2f81b20322dd9e9268001126b07931b437e27df: zero entity-bound operation evidence for this entity/operation. Mother §71 forbids speculative CRUD/sibling-feature expansion; current revision authorizes no new behavior.</w:t>
+            </w:r>
+          </w:p>
+        </w:tc>
+      </w:tr>
+      <w:tr>
+        <w:tc>
+          <w:tcPr>
+            <w:tcW w:type="dxa" w:w="2858"/>
+          </w:tcPr>
+          <w:p>
+            <w:r/>
+            <w:r>
+              <w:rPr>
+                <w:b w:val="0"/>
+                <w:sz w:val="14"/>
+              </w:rPr>
+              <w:t>SchemaMigrationHistory</w:t>
+            </w:r>
+          </w:p>
+        </w:tc>
+        <w:tc>
+          <w:tcPr>
+            <w:tcW w:type="dxa" w:w="2858"/>
+          </w:tcPr>
+          <w:p>
+            <w:r/>
+            <w:r>
+              <w:rPr>
+                <w:b w:val="0"/>
+                <w:sz w:val="14"/>
+              </w:rPr>
+              <w:t>CATEGORY_OR_GROUP_BIND</w:t>
+            </w:r>
+          </w:p>
+        </w:tc>
+        <w:tc>
+          <w:tcPr>
+            <w:tcW w:type="dxa" w:w="2858"/>
+          </w:tcPr>
+          <w:p>
+            <w:r/>
+            <w:r>
+              <w:rPr>
+                <w:b w:val="0"/>
+                <w:sz w:val="14"/>
+              </w:rPr>
+              <w:t>NOT_APPLICABLE</w:t>
+            </w:r>
+          </w:p>
+        </w:tc>
+        <w:tc>
+          <w:tcPr>
+            <w:tcW w:type="dxa" w:w="2858"/>
+          </w:tcPr>
+          <w:p>
+            <w:r/>
+            <w:r>
+              <w:rPr>
+                <w:b w:val="0"/>
+                <w:sz w:val="14"/>
+              </w:rPr>
+              <w:t>Current exact tree b2f81b20322dd9e9268001126b07931b437e27df: zero entity-bound operation evidence for this entity/operation. Mother §71 forbids speculative CRUD/sibling-feature expansion; current revision authorizes no new behavior.</w:t>
+            </w:r>
+          </w:p>
+        </w:tc>
+      </w:tr>
+      <w:tr>
+        <w:tc>
+          <w:tcPr>
+            <w:tcW w:type="dxa" w:w="2858"/>
+          </w:tcPr>
+          <w:p>
+            <w:r/>
+            <w:r>
+              <w:rPr>
+                <w:b w:val="0"/>
+                <w:sz w:val="14"/>
+              </w:rPr>
+              <w:t>SchemaMigrationHistory</w:t>
+            </w:r>
+          </w:p>
+        </w:tc>
+        <w:tc>
+          <w:tcPr>
+            <w:tcW w:type="dxa" w:w="2858"/>
+          </w:tcPr>
+          <w:p>
+            <w:r/>
+            <w:r>
+              <w:rPr>
+                <w:b w:val="0"/>
+                <w:sz w:val="14"/>
+              </w:rPr>
+              <w:t>CONFIRM_OR_APPROVE</w:t>
+            </w:r>
+          </w:p>
+        </w:tc>
+        <w:tc>
+          <w:tcPr>
+            <w:tcW w:type="dxa" w:w="2858"/>
+          </w:tcPr>
+          <w:p>
+            <w:r/>
+            <w:r>
+              <w:rPr>
+                <w:b w:val="0"/>
+                <w:sz w:val="14"/>
+              </w:rPr>
+              <w:t>NOT_APPLICABLE</w:t>
+            </w:r>
+          </w:p>
+        </w:tc>
+        <w:tc>
+          <w:tcPr>
+            <w:tcW w:type="dxa" w:w="2858"/>
+          </w:tcPr>
+          <w:p>
+            <w:r/>
+            <w:r>
+              <w:rPr>
+                <w:b w:val="0"/>
+                <w:sz w:val="14"/>
+              </w:rPr>
+              <w:t>Current exact tree b2f81b20322dd9e9268001126b07931b437e27df: zero entity-bound operation evidence for this entity/operation. Mother §71 forbids speculative CRUD/sibling-feature expansion; current revision authorizes no new behavior.</w:t>
+            </w:r>
+          </w:p>
+        </w:tc>
+      </w:tr>
+      <w:tr>
+        <w:tc>
+          <w:tcPr>
+            <w:tcW w:type="dxa" w:w="2858"/>
+          </w:tcPr>
+          <w:p>
+            <w:r/>
+            <w:r>
+              <w:rPr>
+                <w:b w:val="0"/>
+                <w:sz w:val="14"/>
+              </w:rPr>
+              <w:t>SchemaMigrationHistory</w:t>
+            </w:r>
+          </w:p>
+        </w:tc>
+        <w:tc>
+          <w:tcPr>
+            <w:tcW w:type="dxa" w:w="2858"/>
+          </w:tcPr>
+          <w:p>
+            <w:r/>
+            <w:r>
+              <w:rPr>
+                <w:b w:val="0"/>
+                <w:sz w:val="14"/>
+              </w:rPr>
+              <w:t>CREATE</w:t>
+            </w:r>
+          </w:p>
+        </w:tc>
+        <w:tc>
+          <w:tcPr>
+            <w:tcW w:type="dxa" w:w="2858"/>
+          </w:tcPr>
+          <w:p>
+            <w:r/>
+            <w:r>
+              <w:rPr>
+                <w:b w:val="0"/>
+                <w:sz w:val="14"/>
+              </w:rPr>
+              <w:t>NOT_APPLICABLE</w:t>
+            </w:r>
+          </w:p>
+        </w:tc>
+        <w:tc>
+          <w:tcPr>
+            <w:tcW w:type="dxa" w:w="2858"/>
+          </w:tcPr>
+          <w:p>
+            <w:r/>
+            <w:r>
+              <w:rPr>
+                <w:b w:val="0"/>
+                <w:sz w:val="14"/>
+              </w:rPr>
+              <w:t>Current exact tree b2f81b20322dd9e9268001126b07931b437e27df: zero entity-bound operation evidence for this entity/operation. Mother §71 forbids speculative CRUD/sibling-feature expansion; current revision authorizes no new behavior.</w:t>
+            </w:r>
+          </w:p>
+        </w:tc>
+      </w:tr>
+      <w:tr>
+        <w:tc>
+          <w:tcPr>
+            <w:tcW w:type="dxa" w:w="2858"/>
+          </w:tcPr>
+          <w:p>
+            <w:r/>
+            <w:r>
+              <w:rPr>
+                <w:b w:val="0"/>
+                <w:sz w:val="14"/>
+              </w:rPr>
+              <w:t>SchemaMigrationHistory</w:t>
+            </w:r>
+          </w:p>
+        </w:tc>
+        <w:tc>
+          <w:tcPr>
+            <w:tcW w:type="dxa" w:w="2858"/>
+          </w:tcPr>
+          <w:p>
+            <w:r/>
+            <w:r>
+              <w:rPr>
+                <w:b w:val="0"/>
+                <w:sz w:val="14"/>
+              </w:rPr>
+              <w:t>CREATION_MODE</w:t>
+            </w:r>
+          </w:p>
+        </w:tc>
+        <w:tc>
+          <w:tcPr>
+            <w:tcW w:type="dxa" w:w="2858"/>
+          </w:tcPr>
+          <w:p>
+            <w:r/>
+            <w:r>
+              <w:rPr>
+                <w:b w:val="0"/>
+                <w:sz w:val="14"/>
+              </w:rPr>
+              <w:t>NOT_APPLICABLE</w:t>
+            </w:r>
+          </w:p>
+        </w:tc>
+        <w:tc>
+          <w:tcPr>
+            <w:tcW w:type="dxa" w:w="2858"/>
+          </w:tcPr>
+          <w:p>
+            <w:r/>
+            <w:r>
+              <w:rPr>
+                <w:b w:val="0"/>
+                <w:sz w:val="14"/>
+              </w:rPr>
+              <w:t>Current exact tree b2f81b20322dd9e9268001126b07931b437e27df: zero entity-bound operation evidence for this entity/operation. Mother §71 forbids speculative CRUD/sibling-feature expansion; current revision authorizes no new behavior.</w:t>
+            </w:r>
+          </w:p>
+        </w:tc>
+      </w:tr>
+      <w:tr>
+        <w:tc>
+          <w:tcPr>
+            <w:tcW w:type="dxa" w:w="2858"/>
+          </w:tcPr>
+          <w:p>
+            <w:r/>
+            <w:r>
+              <w:rPr>
+                <w:b w:val="0"/>
+                <w:sz w:val="14"/>
+              </w:rPr>
+              <w:t>SchemaMigrationHistory</w:t>
+            </w:r>
+          </w:p>
+        </w:tc>
+        <w:tc>
+          <w:tcPr>
+            <w:tcW w:type="dxa" w:w="2858"/>
+          </w:tcPr>
+          <w:p>
+            <w:r/>
+            <w:r>
+              <w:rPr>
+                <w:b w:val="0"/>
+                <w:sz w:val="14"/>
+              </w:rPr>
+              <w:t>DEPENDENCY_IMPACT</w:t>
+            </w:r>
+          </w:p>
+        </w:tc>
+        <w:tc>
+          <w:tcPr>
+            <w:tcW w:type="dxa" w:w="2858"/>
+          </w:tcPr>
+          <w:p>
+            <w:r/>
+            <w:r>
+              <w:rPr>
+                <w:b w:val="0"/>
+                <w:sz w:val="14"/>
+              </w:rPr>
+              <w:t>NOT_APPLICABLE</w:t>
+            </w:r>
+          </w:p>
+        </w:tc>
+        <w:tc>
+          <w:tcPr>
+            <w:tcW w:type="dxa" w:w="2858"/>
+          </w:tcPr>
+          <w:p>
+            <w:r/>
+            <w:r>
+              <w:rPr>
+                <w:b w:val="0"/>
+                <w:sz w:val="14"/>
+              </w:rPr>
+              <w:t>Current exact tree b2f81b20322dd9e9268001126b07931b437e27df: zero entity-bound operation evidence for this entity/operation. Mother §71 forbids speculative CRUD/sibling-feature expansion; current revision authorizes no new behavior.</w:t>
+            </w:r>
+          </w:p>
+        </w:tc>
+      </w:tr>
+      <w:tr>
+        <w:tc>
+          <w:tcPr>
+            <w:tcW w:type="dxa" w:w="2858"/>
+          </w:tcPr>
+          <w:p>
+            <w:r/>
+            <w:r>
+              <w:rPr>
+                <w:b w:val="0"/>
+                <w:sz w:val="14"/>
+              </w:rPr>
+              <w:t>SchemaMigrationHistory</w:t>
+            </w:r>
+          </w:p>
+        </w:tc>
+        <w:tc>
+          <w:tcPr>
+            <w:tcW w:type="dxa" w:w="2858"/>
+          </w:tcPr>
+          <w:p>
+            <w:r/>
+            <w:r>
+              <w:rPr>
+                <w:b w:val="0"/>
+                <w:sz w:val="14"/>
+              </w:rPr>
+              <w:t>DISCOVER_OR_LIST</w:t>
+            </w:r>
+          </w:p>
+        </w:tc>
+        <w:tc>
+          <w:tcPr>
+            <w:tcW w:type="dxa" w:w="2858"/>
+          </w:tcPr>
+          <w:p>
+            <w:r/>
+            <w:r>
+              <w:rPr>
+                <w:b w:val="0"/>
+                <w:sz w:val="14"/>
+              </w:rPr>
+              <w:t>NOT_APPLICABLE</w:t>
+            </w:r>
+          </w:p>
+        </w:tc>
+        <w:tc>
+          <w:tcPr>
+            <w:tcW w:type="dxa" w:w="2858"/>
+          </w:tcPr>
+          <w:p>
+            <w:r/>
+            <w:r>
+              <w:rPr>
+                <w:b w:val="0"/>
+                <w:sz w:val="14"/>
+              </w:rPr>
+              <w:t>Current exact tree b2f81b20322dd9e9268001126b07931b437e27df: zero entity-bound operation evidence for this entity/operation. Mother §71 forbids speculative CRUD/sibling-feature expansion; current revision authorizes no new behavior.</w:t>
+            </w:r>
+          </w:p>
+        </w:tc>
+      </w:tr>
+      <w:tr>
+        <w:tc>
+          <w:tcPr>
+            <w:tcW w:type="dxa" w:w="2858"/>
+          </w:tcPr>
+          <w:p>
+            <w:r/>
+            <w:r>
+              <w:rPr>
+                <w:b w:val="0"/>
+                <w:sz w:val="14"/>
+              </w:rPr>
+              <w:t>SchemaMigrationHistory</w:t>
+            </w:r>
+          </w:p>
+        </w:tc>
+        <w:tc>
+          <w:tcPr>
+            <w:tcW w:type="dxa" w:w="2858"/>
+          </w:tcPr>
+          <w:p>
+            <w:r/>
+            <w:r>
+              <w:rPr>
+                <w:b w:val="0"/>
+                <w:sz w:val="14"/>
+              </w:rPr>
+              <w:t>DRAFT</w:t>
+            </w:r>
+          </w:p>
+        </w:tc>
+        <w:tc>
+          <w:tcPr>
+            <w:tcW w:type="dxa" w:w="2858"/>
+          </w:tcPr>
+          <w:p>
+            <w:r/>
+            <w:r>
+              <w:rPr>
+                <w:b w:val="0"/>
+                <w:sz w:val="14"/>
+              </w:rPr>
+              <w:t>NOT_APPLICABLE</w:t>
+            </w:r>
+          </w:p>
+        </w:tc>
+        <w:tc>
+          <w:tcPr>
+            <w:tcW w:type="dxa" w:w="2858"/>
+          </w:tcPr>
+          <w:p>
+            <w:r/>
+            <w:r>
+              <w:rPr>
+                <w:b w:val="0"/>
+                <w:sz w:val="14"/>
+              </w:rPr>
+              <w:t>Current exact tree b2f81b20322dd9e9268001126b07931b437e27df: zero entity-bound operation evidence for this entity/operation. Mother §71 forbids speculative CRUD/sibling-feature expansion; current revision authorizes no new behavior.</w:t>
+            </w:r>
+          </w:p>
+        </w:tc>
+      </w:tr>
+      <w:tr>
+        <w:tc>
+          <w:tcPr>
+            <w:tcW w:type="dxa" w:w="2858"/>
+          </w:tcPr>
+          <w:p>
+            <w:r/>
+            <w:r>
+              <w:rPr>
+                <w:b w:val="0"/>
+                <w:sz w:val="14"/>
+              </w:rPr>
+              <w:t>SchemaMigrationHistory</w:t>
+            </w:r>
+          </w:p>
+        </w:tc>
+        <w:tc>
+          <w:tcPr>
+            <w:tcW w:type="dxa" w:w="2858"/>
+          </w:tcPr>
+          <w:p>
+            <w:r/>
+            <w:r>
+              <w:rPr>
+                <w:b w:val="0"/>
+                <w:sz w:val="14"/>
+              </w:rPr>
+              <w:t>EDIT</w:t>
+            </w:r>
+          </w:p>
+        </w:tc>
+        <w:tc>
+          <w:tcPr>
+            <w:tcW w:type="dxa" w:w="2858"/>
+          </w:tcPr>
+          <w:p>
+            <w:r/>
+            <w:r>
+              <w:rPr>
+                <w:b w:val="0"/>
+                <w:sz w:val="14"/>
+              </w:rPr>
+              <w:t>NOT_APPLICABLE</w:t>
+            </w:r>
+          </w:p>
+        </w:tc>
+        <w:tc>
+          <w:tcPr>
+            <w:tcW w:type="dxa" w:w="2858"/>
+          </w:tcPr>
+          <w:p>
+            <w:r/>
+            <w:r>
+              <w:rPr>
+                <w:b w:val="0"/>
+                <w:sz w:val="14"/>
+              </w:rPr>
+              <w:t>Current exact tree b2f81b20322dd9e9268001126b07931b437e27df: zero entity-bound operation evidence for this entity/operation. Mother §71 forbids speculative CRUD/sibling-feature expansion; current revision authorizes no new behavior.</w:t>
+            </w:r>
+          </w:p>
+        </w:tc>
+      </w:tr>
+      <w:tr>
+        <w:tc>
+          <w:tcPr>
+            <w:tcW w:type="dxa" w:w="2858"/>
+          </w:tcPr>
+          <w:p>
+            <w:r/>
+            <w:r>
+              <w:rPr>
+                <w:b w:val="0"/>
+                <w:sz w:val="14"/>
+              </w:rPr>
+              <w:t>SchemaMigrationHistory</w:t>
+            </w:r>
+          </w:p>
+        </w:tc>
+        <w:tc>
+          <w:tcPr>
+            <w:tcW w:type="dxa" w:w="2858"/>
+          </w:tcPr>
+          <w:p>
+            <w:r/>
+            <w:r>
+              <w:rPr>
+                <w:b w:val="0"/>
+                <w:sz w:val="14"/>
+              </w:rPr>
+              <w:t>ERROR_RECOVERY</w:t>
+            </w:r>
+          </w:p>
+        </w:tc>
+        <w:tc>
+          <w:tcPr>
+            <w:tcW w:type="dxa" w:w="2858"/>
+          </w:tcPr>
+          <w:p>
+            <w:r/>
+            <w:r>
+              <w:rPr>
+                <w:b w:val="0"/>
+                <w:sz w:val="14"/>
+              </w:rPr>
+              <w:t>NOT_APPLICABLE</w:t>
+            </w:r>
+          </w:p>
+        </w:tc>
+        <w:tc>
+          <w:tcPr>
+            <w:tcW w:type="dxa" w:w="2858"/>
+          </w:tcPr>
+          <w:p>
+            <w:r/>
+            <w:r>
+              <w:rPr>
+                <w:b w:val="0"/>
+                <w:sz w:val="14"/>
+              </w:rPr>
+              <w:t>Current exact tree b2f81b20322dd9e9268001126b07931b437e27df: zero entity-bound operation evidence for this entity/operation. Mother §71 forbids speculative CRUD/sibling-feature expansion; current revision authorizes no new behavior.</w:t>
+            </w:r>
+          </w:p>
+        </w:tc>
+      </w:tr>
+      <w:tr>
+        <w:tc>
+          <w:tcPr>
+            <w:tcW w:type="dxa" w:w="2858"/>
+          </w:tcPr>
+          <w:p>
+            <w:r/>
+            <w:r>
+              <w:rPr>
+                <w:b w:val="0"/>
+                <w:sz w:val="14"/>
+              </w:rPr>
+              <w:t>SchemaMigrationHistory</w:t>
+            </w:r>
+          </w:p>
+        </w:tc>
+        <w:tc>
+          <w:tcPr>
+            <w:tcW w:type="dxa" w:w="2858"/>
+          </w:tcPr>
+          <w:p>
+            <w:r/>
+            <w:r>
+              <w:rPr>
+                <w:b w:val="0"/>
+                <w:sz w:val="14"/>
+              </w:rPr>
+              <w:t>LOCK_OR_UNLOCK</w:t>
+            </w:r>
+          </w:p>
+        </w:tc>
+        <w:tc>
+          <w:tcPr>
+            <w:tcW w:type="dxa" w:w="2858"/>
+          </w:tcPr>
+          <w:p>
+            <w:r/>
+            <w:r>
+              <w:rPr>
+                <w:b w:val="0"/>
+                <w:sz w:val="14"/>
+              </w:rPr>
+              <w:t>NOT_APPLICABLE</w:t>
+            </w:r>
+          </w:p>
+        </w:tc>
+        <w:tc>
+          <w:tcPr>
+            <w:tcW w:type="dxa" w:w="2858"/>
+          </w:tcPr>
+          <w:p>
+            <w:r/>
+            <w:r>
+              <w:rPr>
+                <w:b w:val="0"/>
+                <w:sz w:val="14"/>
+              </w:rPr>
+              <w:t>Current exact tree b2f81b20322dd9e9268001126b07931b437e27df: zero entity-bound operation evidence for this entity/operation. Mother §71 forbids speculative CRUD/sibling-feature expansion; current revision authorizes no new behavior.</w:t>
+            </w:r>
+          </w:p>
+        </w:tc>
+      </w:tr>
+      <w:tr>
+        <w:tc>
+          <w:tcPr>
+            <w:tcW w:type="dxa" w:w="2858"/>
+          </w:tcPr>
+          <w:p>
+            <w:r/>
+            <w:r>
+              <w:rPr>
+                <w:b w:val="0"/>
+                <w:sz w:val="14"/>
+              </w:rPr>
+              <w:t>SchemaMigrationHistory</w:t>
+            </w:r>
+          </w:p>
+        </w:tc>
+        <w:tc>
+          <w:tcPr>
+            <w:tcW w:type="dxa" w:w="2858"/>
+          </w:tcPr>
+          <w:p>
+            <w:r/>
+            <w:r>
+              <w:rPr>
+                <w:b w:val="0"/>
+                <w:sz w:val="14"/>
+              </w:rPr>
+              <w:t>MOVE_OR_REPARENT</w:t>
+            </w:r>
+          </w:p>
+        </w:tc>
+        <w:tc>
+          <w:tcPr>
+            <w:tcW w:type="dxa" w:w="2858"/>
+          </w:tcPr>
+          <w:p>
+            <w:r/>
+            <w:r>
+              <w:rPr>
+                <w:b w:val="0"/>
+                <w:sz w:val="14"/>
+              </w:rPr>
+              <w:t>NOT_APPLICABLE</w:t>
+            </w:r>
+          </w:p>
+        </w:tc>
+        <w:tc>
+          <w:tcPr>
+            <w:tcW w:type="dxa" w:w="2858"/>
+          </w:tcPr>
+          <w:p>
+            <w:r/>
+            <w:r>
+              <w:rPr>
+                <w:b w:val="0"/>
+                <w:sz w:val="14"/>
+              </w:rPr>
+              <w:t>Current exact tree b2f81b20322dd9e9268001126b07931b437e27df: zero entity-bound operation evidence for this entity/operation. Mother §71 forbids speculative CRUD/sibling-feature expansion; current revision authorizes no new behavior.</w:t>
+            </w:r>
+          </w:p>
+        </w:tc>
+      </w:tr>
+      <w:tr>
+        <w:tc>
+          <w:tcPr>
+            <w:tcW w:type="dxa" w:w="2858"/>
+          </w:tcPr>
+          <w:p>
+            <w:r/>
+            <w:r>
+              <w:rPr>
+                <w:b w:val="0"/>
+                <w:sz w:val="14"/>
+              </w:rPr>
+              <w:t>SchemaMigrationHistory</w:t>
+            </w:r>
+          </w:p>
+        </w:tc>
+        <w:tc>
+          <w:tcPr>
+            <w:tcW w:type="dxa" w:w="2858"/>
+          </w:tcPr>
+          <w:p>
+            <w:r/>
+            <w:r>
+              <w:rPr>
+                <w:b w:val="0"/>
+                <w:sz w:val="14"/>
+              </w:rPr>
+              <w:t>NEXT_STEP</w:t>
+            </w:r>
+          </w:p>
+        </w:tc>
+        <w:tc>
+          <w:tcPr>
+            <w:tcW w:type="dxa" w:w="2858"/>
+          </w:tcPr>
+          <w:p>
+            <w:r/>
+            <w:r>
+              <w:rPr>
+                <w:b w:val="0"/>
+                <w:sz w:val="14"/>
+              </w:rPr>
+              <w:t>NOT_APPLICABLE</w:t>
+            </w:r>
+          </w:p>
+        </w:tc>
+        <w:tc>
+          <w:tcPr>
+            <w:tcW w:type="dxa" w:w="2858"/>
+          </w:tcPr>
+          <w:p>
+            <w:r/>
+            <w:r>
+              <w:rPr>
+                <w:b w:val="0"/>
+                <w:sz w:val="14"/>
+              </w:rPr>
+              <w:t>Current exact tree b2f81b20322dd9e9268001126b07931b437e27df: zero entity-bound operation evidence for this entity/operation. Mother §71 forbids speculative CRUD/sibling-feature expansion; current revision authorizes no new behavior.</w:t>
+            </w:r>
+          </w:p>
+        </w:tc>
+      </w:tr>
+      <w:tr>
+        <w:tc>
+          <w:tcPr>
+            <w:tcW w:type="dxa" w:w="2858"/>
+          </w:tcPr>
+          <w:p>
+            <w:r/>
+            <w:r>
+              <w:rPr>
+                <w:b w:val="0"/>
+                <w:sz w:val="14"/>
+              </w:rPr>
+              <w:t>SchemaMigrationHistory</w:t>
+            </w:r>
+          </w:p>
+        </w:tc>
+        <w:tc>
+          <w:tcPr>
+            <w:tcW w:type="dxa" w:w="2858"/>
+          </w:tcPr>
+          <w:p>
+            <w:r/>
+            <w:r>
+              <w:rPr>
+                <w:b w:val="0"/>
+                <w:sz w:val="14"/>
+              </w:rPr>
+              <w:t>PARENT_BIND</w:t>
+            </w:r>
+          </w:p>
+        </w:tc>
+        <w:tc>
+          <w:tcPr>
+            <w:tcW w:type="dxa" w:w="2858"/>
+          </w:tcPr>
+          <w:p>
+            <w:r/>
+            <w:r>
+              <w:rPr>
+                <w:b w:val="0"/>
+                <w:sz w:val="14"/>
+              </w:rPr>
+              <w:t>NOT_APPLICABLE</w:t>
+            </w:r>
+          </w:p>
+        </w:tc>
+        <w:tc>
+          <w:tcPr>
+            <w:tcW w:type="dxa" w:w="2858"/>
+          </w:tcPr>
+          <w:p>
+            <w:r/>
+            <w:r>
+              <w:rPr>
+                <w:b w:val="0"/>
+                <w:sz w:val="14"/>
+              </w:rPr>
+              <w:t>Current exact tree b2f81b20322dd9e9268001126b07931b437e27df: zero entity-bound operation evidence for this entity/operation. Mother §71 forbids speculative CRUD/sibling-feature expansion; current revision authorizes no new behavior.</w:t>
+            </w:r>
+          </w:p>
+        </w:tc>
+      </w:tr>
+      <w:tr>
+        <w:tc>
+          <w:tcPr>
+            <w:tcW w:type="dxa" w:w="2858"/>
+          </w:tcPr>
+          <w:p>
+            <w:r/>
+            <w:r>
+              <w:rPr>
+                <w:b w:val="0"/>
+                <w:sz w:val="14"/>
+              </w:rPr>
+              <w:t>SchemaMigrationHistory</w:t>
+            </w:r>
+          </w:p>
+        </w:tc>
+        <w:tc>
+          <w:tcPr>
+            <w:tcW w:type="dxa" w:w="2858"/>
+          </w:tcPr>
+          <w:p>
+            <w:r/>
+            <w:r>
+              <w:rPr>
+                <w:b w:val="0"/>
+                <w:sz w:val="14"/>
+              </w:rPr>
+              <w:t>REORDER</w:t>
+            </w:r>
+          </w:p>
+        </w:tc>
+        <w:tc>
+          <w:tcPr>
+            <w:tcW w:type="dxa" w:w="2858"/>
+          </w:tcPr>
+          <w:p>
+            <w:r/>
+            <w:r>
+              <w:rPr>
+                <w:b w:val="0"/>
+                <w:sz w:val="14"/>
+              </w:rPr>
+              <w:t>NOT_APPLICABLE</w:t>
+            </w:r>
+          </w:p>
+        </w:tc>
+        <w:tc>
+          <w:tcPr>
+            <w:tcW w:type="dxa" w:w="2858"/>
+          </w:tcPr>
+          <w:p>
+            <w:r/>
+            <w:r>
+              <w:rPr>
+                <w:b w:val="0"/>
+                <w:sz w:val="14"/>
+              </w:rPr>
+              <w:t>Current exact tree b2f81b20322dd9e9268001126b07931b437e27df: zero entity-bound operation evidence for this entity/operation. Mother §71 forbids speculative CRUD/sibling-feature expansion; current revision authorizes no new behavior.</w:t>
+            </w:r>
+          </w:p>
+        </w:tc>
+      </w:tr>
+      <w:tr>
+        <w:tc>
+          <w:tcPr>
+            <w:tcW w:type="dxa" w:w="2858"/>
+          </w:tcPr>
+          <w:p>
+            <w:r/>
+            <w:r>
+              <w:rPr>
+                <w:b w:val="0"/>
+                <w:sz w:val="14"/>
+              </w:rPr>
+              <w:t>SchemaMigrationHistory</w:t>
+            </w:r>
+          </w:p>
+        </w:tc>
+        <w:tc>
+          <w:tcPr>
+            <w:tcW w:type="dxa" w:w="2858"/>
+          </w:tcPr>
+          <w:p>
+            <w:r/>
+            <w:r>
+              <w:rPr>
+                <w:b w:val="0"/>
+                <w:sz w:val="14"/>
+              </w:rPr>
+              <w:t>RESTORE</w:t>
+            </w:r>
+          </w:p>
+        </w:tc>
+        <w:tc>
+          <w:tcPr>
+            <w:tcW w:type="dxa" w:w="2858"/>
+          </w:tcPr>
+          <w:p>
+            <w:r/>
+            <w:r>
+              <w:rPr>
+                <w:b w:val="0"/>
+                <w:sz w:val="14"/>
+              </w:rPr>
+              <w:t>NOT_APPLICABLE</w:t>
+            </w:r>
+          </w:p>
+        </w:tc>
+        <w:tc>
+          <w:tcPr>
+            <w:tcW w:type="dxa" w:w="2858"/>
+          </w:tcPr>
+          <w:p>
+            <w:r/>
+            <w:r>
+              <w:rPr>
+                <w:b w:val="0"/>
+                <w:sz w:val="14"/>
+              </w:rPr>
+              <w:t>Current exact tree b2f81b20322dd9e9268001126b07931b437e27df: zero entity-bound operation evidence for this entity/operation. Mother §71 forbids speculative CRUD/sibling-feature expansion; current revision authorizes no new behavior.</w:t>
+            </w:r>
+          </w:p>
+        </w:tc>
+      </w:tr>
+      <w:tr>
+        <w:tc>
+          <w:tcPr>
+            <w:tcW w:type="dxa" w:w="2858"/>
+          </w:tcPr>
+          <w:p>
+            <w:r/>
+            <w:r>
+              <w:rPr>
+                <w:b w:val="0"/>
+                <w:sz w:val="14"/>
+              </w:rPr>
+              <w:t>SchemaMigrationHistory</w:t>
+            </w:r>
+          </w:p>
+        </w:tc>
+        <w:tc>
+          <w:tcPr>
+            <w:tcW w:type="dxa" w:w="2858"/>
+          </w:tcPr>
+          <w:p>
+            <w:r/>
+            <w:r>
+              <w:rPr>
+                <w:b w:val="0"/>
+                <w:sz w:val="14"/>
+              </w:rPr>
+              <w:t>RESUME</w:t>
+            </w:r>
+          </w:p>
+        </w:tc>
+        <w:tc>
+          <w:tcPr>
+            <w:tcW w:type="dxa" w:w="2858"/>
+          </w:tcPr>
+          <w:p>
+            <w:r/>
+            <w:r>
+              <w:rPr>
+                <w:b w:val="0"/>
+                <w:sz w:val="14"/>
+              </w:rPr>
+              <w:t>NOT_APPLICABLE</w:t>
+            </w:r>
+          </w:p>
+        </w:tc>
+        <w:tc>
+          <w:tcPr>
+            <w:tcW w:type="dxa" w:w="2858"/>
+          </w:tcPr>
+          <w:p>
+            <w:r/>
+            <w:r>
+              <w:rPr>
+                <w:b w:val="0"/>
+                <w:sz w:val="14"/>
+              </w:rPr>
+              <w:t>Current exact tree b2f81b20322dd9e9268001126b07931b437e27df: zero entity-bound operation evidence for this entity/operation. Mother §71 forbids speculative CRUD/sibling-feature expansion; current revision authorizes no new behavior.</w:t>
+            </w:r>
+          </w:p>
+        </w:tc>
+      </w:tr>
+      <w:tr>
+        <w:tc>
+          <w:tcPr>
+            <w:tcW w:type="dxa" w:w="2858"/>
+          </w:tcPr>
+          <w:p>
+            <w:r/>
+            <w:r>
+              <w:rPr>
+                <w:b w:val="0"/>
+                <w:sz w:val="14"/>
+              </w:rPr>
+              <w:t>SchemaMigrationHistory</w:t>
+            </w:r>
+          </w:p>
+        </w:tc>
+        <w:tc>
+          <w:tcPr>
+            <w:tcW w:type="dxa" w:w="2858"/>
+          </w:tcPr>
+          <w:p>
+            <w:r/>
+            <w:r>
+              <w:rPr>
+                <w:b w:val="0"/>
+                <w:sz w:val="14"/>
+              </w:rPr>
+              <w:t>REVISE</w:t>
+            </w:r>
+          </w:p>
+        </w:tc>
+        <w:tc>
+          <w:tcPr>
+            <w:tcW w:type="dxa" w:w="2858"/>
+          </w:tcPr>
+          <w:p>
+            <w:r/>
+            <w:r>
+              <w:rPr>
+                <w:b w:val="0"/>
+                <w:sz w:val="14"/>
+              </w:rPr>
+              <w:t>NOT_APPLICABLE</w:t>
+            </w:r>
+          </w:p>
+        </w:tc>
+        <w:tc>
+          <w:tcPr>
+            <w:tcW w:type="dxa" w:w="2858"/>
+          </w:tcPr>
+          <w:p>
+            <w:r/>
+            <w:r>
+              <w:rPr>
+                <w:b w:val="0"/>
+                <w:sz w:val="14"/>
+              </w:rPr>
+              <w:t>Current exact tree b2f81b20322dd9e9268001126b07931b437e27df: zero entity-bound operation evidence for this entity/operation. Mother §71 forbids speculative CRUD/sibling-feature expansion; current revision authorizes no new behavior.</w:t>
+            </w:r>
+          </w:p>
+        </w:tc>
+      </w:tr>
+      <w:tr>
+        <w:tc>
+          <w:tcPr>
+            <w:tcW w:type="dxa" w:w="2858"/>
+          </w:tcPr>
+          <w:p>
+            <w:r/>
+            <w:r>
+              <w:rPr>
+                <w:b w:val="0"/>
+                <w:sz w:val="14"/>
+              </w:rPr>
+              <w:t>SchemaMigrationHistory</w:t>
+            </w:r>
+          </w:p>
+        </w:tc>
+        <w:tc>
+          <w:tcPr>
+            <w:tcW w:type="dxa" w:w="2858"/>
+          </w:tcPr>
+          <w:p>
+            <w:r/>
+            <w:r>
+              <w:rPr>
+                <w:b w:val="0"/>
+                <w:sz w:val="14"/>
+              </w:rPr>
+              <w:t>SAVE</w:t>
+            </w:r>
+          </w:p>
+        </w:tc>
+        <w:tc>
+          <w:tcPr>
+            <w:tcW w:type="dxa" w:w="2858"/>
+          </w:tcPr>
+          <w:p>
+            <w:r/>
+            <w:r>
+              <w:rPr>
+                <w:b w:val="0"/>
+                <w:sz w:val="14"/>
+              </w:rPr>
+              <w:t>NOT_APPLICABLE</w:t>
+            </w:r>
+          </w:p>
+        </w:tc>
+        <w:tc>
+          <w:tcPr>
+            <w:tcW w:type="dxa" w:w="2858"/>
+          </w:tcPr>
+          <w:p>
+            <w:r/>
+            <w:r>
+              <w:rPr>
+                <w:b w:val="0"/>
+                <w:sz w:val="14"/>
+              </w:rPr>
+              <w:t>Current exact tree b2f81b20322dd9e9268001126b07931b437e27df: zero entity-bound operation evidence for this entity/operation. Mother §71 forbids speculative CRUD/sibling-feature expansion; current revision authorizes no new behavior.</w:t>
+            </w:r>
+          </w:p>
+        </w:tc>
+      </w:tr>
+      <w:tr>
+        <w:tc>
+          <w:tcPr>
+            <w:tcW w:type="dxa" w:w="2858"/>
+          </w:tcPr>
+          <w:p>
+            <w:r/>
+            <w:r>
+              <w:rPr>
+                <w:b w:val="0"/>
+                <w:sz w:val="14"/>
+              </w:rPr>
+              <w:t>SchemaMigrationHistory</w:t>
+            </w:r>
+          </w:p>
+        </w:tc>
+        <w:tc>
+          <w:tcPr>
+            <w:tcW w:type="dxa" w:w="2858"/>
+          </w:tcPr>
+          <w:p>
+            <w:r/>
+            <w:r>
+              <w:rPr>
+                <w:b w:val="0"/>
+                <w:sz w:val="14"/>
+              </w:rPr>
+              <w:t>SELECT_OR_OPEN</w:t>
+            </w:r>
+          </w:p>
+        </w:tc>
+        <w:tc>
+          <w:tcPr>
+            <w:tcW w:type="dxa" w:w="2858"/>
+          </w:tcPr>
+          <w:p>
+            <w:r/>
+            <w:r>
+              <w:rPr>
+                <w:b w:val="0"/>
+                <w:sz w:val="14"/>
+              </w:rPr>
+              <w:t>NOT_APPLICABLE</w:t>
+            </w:r>
+          </w:p>
+        </w:tc>
+        <w:tc>
+          <w:tcPr>
+            <w:tcW w:type="dxa" w:w="2858"/>
+          </w:tcPr>
+          <w:p>
+            <w:r/>
+            <w:r>
+              <w:rPr>
+                <w:b w:val="0"/>
+                <w:sz w:val="14"/>
+              </w:rPr>
+              <w:t>Current exact tree b2f81b20322dd9e9268001126b07931b437e27df: zero entity-bound operation evidence for this entity/operation. Mother §71 forbids speculative CRUD/sibling-feature expansion; current revision authorizes no new behavior.</w:t>
+            </w:r>
+          </w:p>
+        </w:tc>
+      </w:tr>
+      <w:tr>
+        <w:tc>
+          <w:tcPr>
+            <w:tcW w:type="dxa" w:w="2858"/>
+          </w:tcPr>
+          <w:p>
+            <w:r/>
+            <w:r>
+              <w:rPr>
+                <w:b w:val="0"/>
+                <w:sz w:val="14"/>
+              </w:rPr>
+              <w:t>SchemaMigrationHistory</w:t>
+            </w:r>
+          </w:p>
+        </w:tc>
+        <w:tc>
+          <w:tcPr>
+            <w:tcW w:type="dxa" w:w="2858"/>
+          </w:tcPr>
+          <w:p>
+            <w:r/>
+            <w:r>
+              <w:rPr>
+                <w:b w:val="0"/>
+                <w:sz w:val="14"/>
+              </w:rPr>
+              <w:t>VALIDATE</w:t>
+            </w:r>
+          </w:p>
+        </w:tc>
+        <w:tc>
+          <w:tcPr>
+            <w:tcW w:type="dxa" w:w="2858"/>
+          </w:tcPr>
+          <w:p>
+            <w:r/>
+            <w:r>
+              <w:rPr>
+                <w:b w:val="0"/>
+                <w:sz w:val="14"/>
+              </w:rPr>
+              <w:t>NOT_APPLICABLE</w:t>
+            </w:r>
+          </w:p>
+        </w:tc>
+        <w:tc>
+          <w:tcPr>
+            <w:tcW w:type="dxa" w:w="2858"/>
+          </w:tcPr>
+          <w:p>
+            <w:r/>
+            <w:r>
+              <w:rPr>
+                <w:b w:val="0"/>
+                <w:sz w:val="14"/>
+              </w:rPr>
+              <w:t>Current exact tree b2f81b20322dd9e9268001126b07931b437e27df: zero entity-bound operation evidence for this entity/operation. Mother §71 forbids speculative CRUD/sibling-feature expansion; current revision authorizes no new behavior.</w:t>
+            </w:r>
+          </w:p>
+        </w:tc>
+      </w:tr>
+      <w:tr>
+        <w:tc>
+          <w:tcPr>
+            <w:tcW w:type="dxa" w:w="2858"/>
+          </w:tcPr>
+          <w:p>
+            <w:r/>
+            <w:r>
+              <w:rPr>
+                <w:b w:val="0"/>
+                <w:sz w:val="14"/>
+              </w:rPr>
+              <w:t>SchemaMigrationHistory</w:t>
+            </w:r>
+          </w:p>
+        </w:tc>
+        <w:tc>
+          <w:tcPr>
+            <w:tcW w:type="dxa" w:w="2858"/>
+          </w:tcPr>
+          <w:p>
+            <w:r/>
+            <w:r>
+              <w:rPr>
+                <w:b w:val="0"/>
+                <w:sz w:val="14"/>
+              </w:rPr>
+              <w:t>VERSION</w:t>
+            </w:r>
+          </w:p>
+        </w:tc>
+        <w:tc>
+          <w:tcPr>
+            <w:tcW w:type="dxa" w:w="2858"/>
+          </w:tcPr>
+          <w:p>
+            <w:r/>
+            <w:r>
+              <w:rPr>
+                <w:b w:val="0"/>
+                <w:sz w:val="14"/>
+              </w:rPr>
+              <w:t>NOT_APPLICABLE</w:t>
+            </w:r>
+          </w:p>
+        </w:tc>
+        <w:tc>
+          <w:tcPr>
+            <w:tcW w:type="dxa" w:w="2858"/>
+          </w:tcPr>
+          <w:p>
+            <w:r/>
+            <w:r>
+              <w:rPr>
+                <w:b w:val="0"/>
+                <w:sz w:val="14"/>
+              </w:rPr>
+              <w:t>Current exact tree b2f81b20322dd9e9268001126b07931b437e27df: zero entity-bound operation evidence for this entity/operation. Mother §71 forbids speculative CRUD/sibling-feature expansion; current revision authorizes no new behavior.</w:t>
             </w:r>
           </w:p>
         </w:tc>

</xml_diff>

<commit_message>
fix(acpos): complete requirement and page identity design contracts
</commit_message>
<xml_diff>
--- a/ACPOS_DB-01_MOTHER_BASIC_DESIGN_TECH_PURPLE_v1.0.docx
+++ b/ACPOS_DB-01_MOTHER_BASIC_DESIGN_TECH_PURPLE_v1.0.docx
@@ -35824,6 +35824,271 @@
                 <w:sz w:val="14"/>
               </w:rPr>
               <w:t>Current exact tree b2f81b20322dd9e9268001126b07931b437e27df: zero entity-bound operation evidence for this entity/operation. Mother §71 forbids speculative CRUD/sibling-feature expansion; current revision authorizes no new behavior.</w:t>
+            </w:r>
+          </w:p>
+        </w:tc>
+      </w:tr>
+    </w:tbl>
+    <w:p>
+      <w:r>
+        <w:br w:type="page"/>
+      </w:r>
+    </w:p>
+    <w:p>
+      <w:pPr>
+        <w:pStyle w:val="Heading1"/>
+      </w:pPr>
+      <w:r>
+        <w:t>Mother Planning / Basic Design Closure Annex｜規劃設計規範閉環補充</w:t>
+      </w:r>
+    </w:p>
+    <w:p>
+      <w:r>
+        <w:t>[ACPOS-20260922-PLANNING-DESIGN-CLOSURE-ANNEX-V1]</w:t>
+      </w:r>
+      <w:r>
+        <w:t xml:space="preserve"> 本附錄只補規劃／基本設計規範缺口；原頁面既有功能、Owner、Operation、Permission、Entity、Visual 與跨頁 Authority 仍為同一 Canonical Owner。不得由本附錄發明 Runtime/API/DB/Provider 行為，也不得建立第二套平行規範。</w:t>
+      </w:r>
+    </w:p>
+    <w:p>
+      <w:pPr>
+        <w:pStyle w:val="Heading2"/>
+      </w:pPr>
+      <w:r>
+        <w:t>Requirement Definition Gate Closure｜需求定義補齊</w:t>
+      </w:r>
+    </w:p>
+    <w:p>
+      <w:r>
+        <w:t>[ACPOS-DESIGN-CLOSURE:DB-01:REQUIREMENTS]</w:t>
+      </w:r>
+    </w:p>
+    <w:tbl>
+      <w:tblPr>
+        <w:tblStyle w:val="TableGrid"/>
+        <w:tblW w:type="auto" w:w="0"/>
+        <w:tblLook w:firstColumn="1" w:firstRow="1" w:lastColumn="0" w:lastRow="0" w:noHBand="0" w:noVBand="1" w:val="04A0"/>
+      </w:tblPr>
+      <w:tblGrid>
+        <w:gridCol w:w="5717"/>
+        <w:gridCol w:w="5717"/>
+      </w:tblGrid>
+      <w:tr>
+        <w:tc>
+          <w:tcPr>
+            <w:tcW w:type="dxa" w:w="5717"/>
+          </w:tcPr>
+          <w:p>
+            <w:r>
+              <w:t>Design Item / 設計項目</w:t>
+            </w:r>
+          </w:p>
+        </w:tc>
+        <w:tc>
+          <w:tcPr>
+            <w:tcW w:type="dxa" w:w="5717"/>
+          </w:tcPr>
+          <w:p>
+            <w:r>
+              <w:t>Canonical Planning Design Contract / 正式規劃設計契約</w:t>
+            </w:r>
+          </w:p>
+        </w:tc>
+      </w:tr>
+      <w:tr>
+        <w:tc>
+          <w:tcPr>
+            <w:tcW w:type="dxa" w:w="5717"/>
+          </w:tcPr>
+          <w:p>
+            <w:r>
+              <w:t>Project Scope</w:t>
+            </w:r>
+          </w:p>
+        </w:tc>
+        <w:tc>
+          <w:tcPr>
+            <w:tcW w:type="dxa" w:w="5717"/>
+          </w:tcPr>
+          <w:p>
+            <w:r>
+              <w:t>DB-01／資料模型／資料庫治理 current Word planning/basic-design scope；僅補設計規範，不改變已存在產品 Authority。</w:t>
+            </w:r>
+          </w:p>
+        </w:tc>
+      </w:tr>
+      <w:tr>
+        <w:tc>
+          <w:tcPr>
+            <w:tcW w:type="dxa" w:w="5717"/>
+          </w:tcPr>
+          <w:p>
+            <w:r>
+              <w:t>Business Goal</w:t>
+            </w:r>
+          </w:p>
+        </w:tc>
+        <w:tc>
+          <w:tcPr>
+            <w:tcW w:type="dxa" w:w="5717"/>
+          </w:tcPr>
+          <w:p>
+            <w:r>
+              <w:t>以單一治理視角呈現 ACPOS canonical data model、exact version lineage、relationships、schema/migration history、integrity findings 與 audit，供受權限限制的管理／Debug Viewer 使用。</w:t>
+            </w:r>
+          </w:p>
+        </w:tc>
+      </w:tr>
+      <w:tr>
+        <w:tc>
+          <w:tcPr>
+            <w:tcW w:type="dxa" w:w="5717"/>
+          </w:tcPr>
+          <w:p>
+            <w:r>
+              <w:t>Target User / Role Definition</w:t>
+            </w:r>
+          </w:p>
+        </w:tc>
+        <w:tc>
+          <w:tcPr>
+            <w:tcW w:type="dxa" w:w="5717"/>
+          </w:tcPr>
+          <w:p>
+            <w:r>
+              <w:t>具 DB-01 read/debug/governance 權限的內部管理者、系統工程或資料治理人員。</w:t>
+            </w:r>
+          </w:p>
+        </w:tc>
+      </w:tr>
+      <w:tr>
+        <w:tc>
+          <w:tcPr>
+            <w:tcW w:type="dxa" w:w="5717"/>
+          </w:tcPr>
+          <w:p>
+            <w:r>
+              <w:t>Functional Requirements</w:t>
+            </w:r>
+          </w:p>
+        </w:tc>
+        <w:tc>
+          <w:tcPr>
+            <w:tcW w:type="dxa" w:w="5717"/>
+          </w:tcPr>
+          <w:p>
+            <w:r>
+              <w:t>查看 canonical model、relationship、version lineage、schema/migration history、integrity finding、audit/traceability；任何 effectful 行為仍只可使用既有 exact Operation。</w:t>
+            </w:r>
+          </w:p>
+        </w:tc>
+      </w:tr>
+      <w:tr>
+        <w:tc>
+          <w:tcPr>
+            <w:tcW w:type="dxa" w:w="5717"/>
+          </w:tcPr>
+          <w:p>
+            <w:r>
+              <w:t>Non-functional Requirements</w:t>
+            </w:r>
+          </w:p>
+        </w:tc>
+        <w:tc>
+          <w:tcPr>
+            <w:tcW w:type="dxa" w:w="5717"/>
+          </w:tcPr>
+          <w:p>
+            <w:r>
+              <w:t>Read-first、Fail Closed、Real Data Only、Exact Version、Traceability；缺 Authority 時顯示 gap，不合成 schema。</w:t>
+            </w:r>
+          </w:p>
+        </w:tc>
+      </w:tr>
+      <w:tr>
+        <w:tc>
+          <w:tcPr>
+            <w:tcW w:type="dxa" w:w="5717"/>
+          </w:tcPr>
+          <w:p>
+            <w:r>
+              <w:t>Out-of-Scope Definition</w:t>
+            </w:r>
+          </w:p>
+        </w:tc>
+        <w:tc>
+          <w:tcPr>
+            <w:tcW w:type="dxa" w:w="5717"/>
+          </w:tcPr>
+          <w:p>
+            <w:r>
+              <w:t>禁止建立第二套 DB owner、禁止由 Viewer 猜測 schema/relationship、禁止以文件補寫未授權資料 mutation。</w:t>
+            </w:r>
+          </w:p>
+        </w:tc>
+      </w:tr>
+      <w:tr>
+        <w:tc>
+          <w:tcPr>
+            <w:tcW w:type="dxa" w:w="5717"/>
+          </w:tcPr>
+          <w:p>
+            <w:r>
+              <w:t>Glossary</w:t>
+            </w:r>
+          </w:p>
+        </w:tc>
+        <w:tc>
+          <w:tcPr>
+            <w:tcW w:type="dxa" w:w="5717"/>
+          </w:tcPr>
+          <w:p>
+            <w:r>
+              <w:t>DB-01 使用本文既有 Entity / Operation / State / Owner / Evidence / Version 名詞；同義詞不得建立第二 identity。</w:t>
+            </w:r>
+          </w:p>
+        </w:tc>
+      </w:tr>
+      <w:tr>
+        <w:tc>
+          <w:tcPr>
+            <w:tcW w:type="dxa" w:w="5717"/>
+          </w:tcPr>
+          <w:p>
+            <w:r>
+              <w:t>Naming Registry Initial State</w:t>
+            </w:r>
+          </w:p>
+        </w:tc>
+        <w:tc>
+          <w:tcPr>
+            <w:tcW w:type="dxa" w:w="5717"/>
+          </w:tcPr>
+          <w:p>
+            <w:r>
+              <w:t>Page UID=DB-01；Owner File=ACPOS_DB-01_MOTHER_BASIC_DESIGN_TECH_PURPLE_v1.0.docx；Current canonical filename only；禁止 copy/backup/alternate owner。</w:t>
+            </w:r>
+          </w:p>
+        </w:tc>
+      </w:tr>
+      <w:tr>
+        <w:tc>
+          <w:tcPr>
+            <w:tcW w:type="dxa" w:w="5717"/>
+          </w:tcPr>
+          <w:p>
+            <w:r>
+              <w:t>Authority</w:t>
+            </w:r>
+          </w:p>
+        </w:tc>
+        <w:tc>
+          <w:tcPr>
+            <w:tcW w:type="dxa" w:w="5717"/>
+          </w:tcPr>
+          <w:p>
+            <w:r>
+              <w:t>Current DB-01 Word + Mother 01→04；缺產品選擇時 BLOCK，不由本附錄猜測。</w:t>
             </w:r>
           </w:p>
         </w:tc>

</xml_diff>

<commit_message>
fix(acpos): complete design system and layout contracts
</commit_message>
<xml_diff>
--- a/ACPOS_DB-01_MOTHER_BASIC_DESIGN_TECH_PURPLE_v1.0.docx
+++ b/ACPOS_DB-01_MOTHER_BASIC_DESIGN_TECH_PURPLE_v1.0.docx
@@ -36089,6 +36089,228 @@
           <w:p>
             <w:r>
               <w:t>Current DB-01 Word + Mother 01→04；缺產品選擇時 BLOCK，不由本附錄猜測。</w:t>
+            </w:r>
+          </w:p>
+        </w:tc>
+      </w:tr>
+    </w:tbl>
+    <w:p>
+      <w:pPr>
+        <w:pStyle w:val="Heading2"/>
+      </w:pPr>
+      <w:r>
+        <w:t>Design System / Layout Closure｜設計系統與版面補齊</w:t>
+      </w:r>
+    </w:p>
+    <w:p>
+      <w:r>
+        <w:t>[ACPOS-DESIGN-CLOSURE:DB-01:DESIGN-SYSTEM]</w:t>
+      </w:r>
+    </w:p>
+    <w:tbl>
+      <w:tblPr>
+        <w:tblStyle w:val="TableGrid"/>
+        <w:tblW w:type="auto" w:w="0"/>
+        <w:tblLook w:firstColumn="1" w:firstRow="1" w:lastColumn="0" w:lastRow="0" w:noHBand="0" w:noVBand="1" w:val="04A0"/>
+      </w:tblPr>
+      <w:tblGrid>
+        <w:gridCol w:w="5717"/>
+        <w:gridCol w:w="5717"/>
+      </w:tblGrid>
+      <w:tr>
+        <w:tc>
+          <w:tcPr>
+            <w:tcW w:type="dxa" w:w="5717"/>
+          </w:tcPr>
+          <w:p>
+            <w:r>
+              <w:t>Design Item / 設計項目</w:t>
+            </w:r>
+          </w:p>
+        </w:tc>
+        <w:tc>
+          <w:tcPr>
+            <w:tcW w:type="dxa" w:w="5717"/>
+          </w:tcPr>
+          <w:p>
+            <w:r>
+              <w:t>Canonical Planning Design Contract / 正式規劃設計契約</w:t>
+            </w:r>
+          </w:p>
+        </w:tc>
+      </w:tr>
+      <w:tr>
+        <w:tc>
+          <w:tcPr>
+            <w:tcW w:type="dxa" w:w="5717"/>
+          </w:tcPr>
+          <w:p>
+            <w:r>
+              <w:t>Color Tokens</w:t>
+            </w:r>
+          </w:p>
+        </w:tc>
+        <w:tc>
+          <w:tcPr>
+            <w:tcW w:type="dxa" w:w="5717"/>
+          </w:tcPr>
+          <w:p>
+            <w:r>
+              <w:t>SHARED_OWNER_REFERENCE → current Global Home / Shell Design System tech-purple token set; existing page-local approved override, if any, remains authoritative.</w:t>
+            </w:r>
+          </w:p>
+        </w:tc>
+      </w:tr>
+      <w:tr>
+        <w:tc>
+          <w:tcPr>
+            <w:tcW w:type="dxa" w:w="5717"/>
+          </w:tcPr>
+          <w:p>
+            <w:r>
+              <w:t>Typography Tokens</w:t>
+            </w:r>
+          </w:p>
+        </w:tc>
+        <w:tc>
+          <w:tcPr>
+            <w:tcW w:type="dxa" w:w="5717"/>
+          </w:tcPr>
+          <w:p>
+            <w:r>
+              <w:t>SHARED_OWNER_REFERENCE → current Global Design System typography; page-local text hierarchy may only use registered heading/body/label/technical text roles.</w:t>
+            </w:r>
+          </w:p>
+        </w:tc>
+      </w:tr>
+      <w:tr>
+        <w:tc>
+          <w:tcPr>
+            <w:tcW w:type="dxa" w:w="5717"/>
+          </w:tcPr>
+          <w:p>
+            <w:r>
+              <w:t>Spacing Tokens</w:t>
+            </w:r>
+          </w:p>
+        </w:tc>
+        <w:tc>
+          <w:tcPr>
+            <w:tcW w:type="dxa" w:w="5717"/>
+          </w:tcPr>
+          <w:p>
+            <w:r>
+              <w:t>Use registered gap/padding/spacing tokens; existing exact page gaps remain authoritative; no ad-hoc pixel drift.</w:t>
+            </w:r>
+          </w:p>
+        </w:tc>
+      </w:tr>
+      <w:tr>
+        <w:tc>
+          <w:tcPr>
+            <w:tcW w:type="dxa" w:w="5717"/>
+          </w:tcPr>
+          <w:p>
+            <w:r>
+              <w:t>Component States</w:t>
+            </w:r>
+          </w:p>
+        </w:tc>
+        <w:tc>
+          <w:tcPr>
+            <w:tcW w:type="dxa" w:w="5717"/>
+          </w:tcPr>
+          <w:p>
+            <w:r>
+              <w:t>Default / Hover / Focus / Active / Loading / Disabled / Success / Error MUST NOT change the approved component footprint unless the current component contract explicitly allows it.</w:t>
+            </w:r>
+          </w:p>
+        </w:tc>
+      </w:tr>
+      <w:tr>
+        <w:tc>
+          <w:tcPr>
+            <w:tcW w:type="dxa" w:w="5717"/>
+          </w:tcPr>
+          <w:p>
+            <w:r>
+              <w:t>Primary Layout</w:t>
+            </w:r>
+          </w:p>
+        </w:tc>
+        <w:tc>
+          <w:tcPr>
+            <w:tcW w:type="dxa" w:w="5717"/>
+          </w:tcPr>
+          <w:p>
+            <w:r>
+              <w:t>Use this Word's existing Primary Grid / Section / Workspace layout as the page-local authority; this annex introduces no second grid.</w:t>
+            </w:r>
+          </w:p>
+        </w:tc>
+      </w:tr>
+      <w:tr>
+        <w:tc>
+          <w:tcPr>
+            <w:tcW w:type="dxa" w:w="5717"/>
+          </w:tcPr>
+          <w:p>
+            <w:r>
+              <w:t>Navigation Region</w:t>
+            </w:r>
+          </w:p>
+        </w:tc>
+        <w:tc>
+          <w:tcPr>
+            <w:tcW w:type="dxa" w:w="5717"/>
+          </w:tcPr>
+          <w:p>
+            <w:r>
+              <w:t>Global Header and collapsible/overlay Sidebar remain shared shell regions; page Workspace starts in the registered content region.</w:t>
+            </w:r>
+          </w:p>
+        </w:tc>
+      </w:tr>
+      <w:tr>
+        <w:tc>
+          <w:tcPr>
+            <w:tcW w:type="dxa" w:w="5717"/>
+          </w:tcPr>
+          <w:p>
+            <w:r>
+              <w:t>Responsive Behavior</w:t>
+            </w:r>
+          </w:p>
+        </w:tc>
+        <w:tc>
+          <w:tcPr>
+            <w:tcW w:type="dxa" w:w="5717"/>
+          </w:tcPr>
+          <w:p>
+            <w:r>
+              <w:t>Use the current page responsive rule and shared shell breakpoint owner; semantic order and functional topology MUST remain stable across reflow.</w:t>
+            </w:r>
+          </w:p>
+        </w:tc>
+      </w:tr>
+      <w:tr>
+        <w:tc>
+          <w:tcPr>
+            <w:tcW w:type="dxa" w:w="5717"/>
+          </w:tcPr>
+          <w:p>
+            <w:r>
+              <w:t>Design Ownership</w:t>
+            </w:r>
+          </w:p>
+        </w:tc>
+        <w:tc>
+          <w:tcPr>
+            <w:tcW w:type="dxa" w:w="5717"/>
+          </w:tcPr>
+          <w:p>
+            <w:r>
+              <w:t>Page owns page-local layout/components; Global Shell owns shared header/sidebar/tokens; references only, no duplicated shared payload.</w:t>
             </w:r>
           </w:p>
         </w:tc>

</xml_diff>

<commit_message>
fix(acpos): complete visual geometry contracts
</commit_message>
<xml_diff>
--- a/ACPOS_DB-01_MOTHER_BASIC_DESIGN_TECH_PURPLE_v1.0.docx
+++ b/ACPOS_DB-01_MOTHER_BASIC_DESIGN_TECH_PURPLE_v1.0.docx
@@ -36311,6 +36311,404 @@
           <w:p>
             <w:r>
               <w:t>Page owns page-local layout/components; Global Shell owns shared header/sidebar/tokens; references only, no duplicated shared payload.</w:t>
+            </w:r>
+          </w:p>
+        </w:tc>
+      </w:tr>
+    </w:tbl>
+    <w:p>
+      <w:pPr>
+        <w:pStyle w:val="Heading2"/>
+      </w:pPr>
+      <w:r>
+        <w:t>Visual Geometry Contract Closure｜視覺幾何補齊</w:t>
+      </w:r>
+    </w:p>
+    <w:p>
+      <w:r>
+        <w:t>[ACPOS-DESIGN-CLOSURE:DB-01:GEOMETRY]</w:t>
+      </w:r>
+    </w:p>
+    <w:tbl>
+      <w:tblPr>
+        <w:tblStyle w:val="TableGrid"/>
+        <w:tblW w:type="auto" w:w="0"/>
+        <w:tblLook w:firstColumn="1" w:firstRow="1" w:lastColumn="0" w:lastRow="0" w:noHBand="0" w:noVBand="1" w:val="04A0"/>
+      </w:tblPr>
+      <w:tblGrid>
+        <w:gridCol w:w="5717"/>
+        <w:gridCol w:w="5717"/>
+      </w:tblGrid>
+      <w:tr>
+        <w:tc>
+          <w:tcPr>
+            <w:tcW w:type="dxa" w:w="5717"/>
+          </w:tcPr>
+          <w:p>
+            <w:r>
+              <w:t>Design Item / 設計項目</w:t>
+            </w:r>
+          </w:p>
+        </w:tc>
+        <w:tc>
+          <w:tcPr>
+            <w:tcW w:type="dxa" w:w="5717"/>
+          </w:tcPr>
+          <w:p>
+            <w:r>
+              <w:t>Canonical Planning Design Contract / 正式規劃設計契約</w:t>
+            </w:r>
+          </w:p>
+        </w:tc>
+      </w:tr>
+      <w:tr>
+        <w:tc>
+          <w:tcPr>
+            <w:tcW w:type="dxa" w:w="5717"/>
+          </w:tcPr>
+          <w:p>
+            <w:r>
+              <w:t>Viewport / Breakpoint UID</w:t>
+            </w:r>
+          </w:p>
+        </w:tc>
+        <w:tc>
+          <w:tcPr>
+            <w:tcW w:type="dxa" w:w="5717"/>
+          </w:tcPr>
+          <w:p>
+            <w:r>
+              <w:t>SHARED_OWNER_REFERENCE → current Global Home breakpoint contract; page-specific breakpoint/reflow rules in this Word override only where explicitly registered.</w:t>
+            </w:r>
+          </w:p>
+        </w:tc>
+      </w:tr>
+      <w:tr>
+        <w:tc>
+          <w:tcPr>
+            <w:tcW w:type="dxa" w:w="5717"/>
+          </w:tcPr>
+          <w:p>
+            <w:r>
+              <w:t>Container Width / Min / Max</w:t>
+            </w:r>
+          </w:p>
+        </w:tc>
+        <w:tc>
+          <w:tcPr>
+            <w:tcW w:type="dxa" w:w="5717"/>
+          </w:tcPr>
+          <w:p>
+            <w:r>
+              <w:t>Retain current Global Shell + page Primary Grid width contract. No page-local implicit width may override an existing exact dimension.</w:t>
+            </w:r>
+          </w:p>
+        </w:tc>
+      </w:tr>
+      <w:tr>
+        <w:tc>
+          <w:tcPr>
+            <w:tcW w:type="dxa" w:w="5717"/>
+          </w:tcPr>
+          <w:p>
+            <w:r>
+              <w:t>Grid Columns / Span / Gutter / Outer Margin</w:t>
+            </w:r>
+          </w:p>
+        </w:tc>
+        <w:tc>
+          <w:tcPr>
+            <w:tcW w:type="dxa" w:w="5717"/>
+          </w:tcPr>
+          <w:p>
+            <w:r>
+              <w:t>Use the existing page Primary Grid / section mapping and current gap/margin values; any structural grid change requires Change Set.</w:t>
+            </w:r>
+          </w:p>
+        </w:tc>
+      </w:tr>
+      <w:tr>
+        <w:tc>
+          <w:tcPr>
+            <w:tcW w:type="dxa" w:w="5717"/>
+          </w:tcPr>
+          <w:p>
+            <w:r>
+              <w:t>Section Bounding Rules</w:t>
+            </w:r>
+          </w:p>
+        </w:tc>
+        <w:tc>
+          <w:tcPr>
+            <w:tcW w:type="dxa" w:w="5717"/>
+          </w:tcPr>
+          <w:p>
+            <w:r>
+              <w:t>Every registered Section remains within its current Workspace region; sticky/fixed/overlay areas MUST NOT occlude required controls.</w:t>
+            </w:r>
+          </w:p>
+        </w:tc>
+      </w:tr>
+      <w:tr>
+        <w:tc>
+          <w:tcPr>
+            <w:tcW w:type="dxa" w:w="5717"/>
+          </w:tcPr>
+          <w:p>
+            <w:r>
+              <w:t>Component / Control / Field Width / Height Rules</w:t>
+            </w:r>
+          </w:p>
+        </w:tc>
+        <w:tc>
+          <w:tcPr>
+            <w:tcW w:type="dxa" w:w="5717"/>
+          </w:tcPr>
+          <w:p>
+            <w:r>
+              <w:t>Use current Control/Field Dimensions or shared component token. State transitions MUST NOT cause layout jump.</w:t>
+            </w:r>
+          </w:p>
+        </w:tc>
+      </w:tr>
+      <w:tr>
+        <w:tc>
+          <w:tcPr>
+            <w:tcW w:type="dxa" w:w="5717"/>
+          </w:tcPr>
+          <w:p>
+            <w:r>
+              <w:t>Min / Max Width / Height</w:t>
+            </w:r>
+          </w:p>
+        </w:tc>
+        <w:tc>
+          <w:tcPr>
+            <w:tcW w:type="dxa" w:w="5717"/>
+          </w:tcPr>
+          <w:p>
+            <w:r>
+              <w:t>Inherit current exact values where present; otherwise shared component minimums apply. Required input/button content may not compress below its registered usable size.</w:t>
+            </w:r>
+          </w:p>
+        </w:tc>
+      </w:tr>
+      <w:tr>
+        <w:tc>
+          <w:tcPr>
+            <w:tcW w:type="dxa" w:w="5717"/>
+          </w:tcPr>
+          <w:p>
+            <w:r>
+              <w:t>Gap / Padding / Alignment</w:t>
+            </w:r>
+          </w:p>
+        </w:tc>
+        <w:tc>
+          <w:tcPr>
+            <w:tcW w:type="dxa" w:w="5717"/>
+          </w:tcPr>
+          <w:p>
+            <w:r>
+              <w:t>Use current page spacing/grid tokens; alignment changes outside token tolerance require Visual Review.</w:t>
+            </w:r>
+          </w:p>
+        </w:tc>
+      </w:tr>
+      <w:tr>
+        <w:tc>
+          <w:tcPr>
+            <w:tcW w:type="dxa" w:w="5717"/>
+          </w:tcPr>
+          <w:p>
+            <w:r>
+              <w:t>Aspect Ratio</w:t>
+            </w:r>
+          </w:p>
+        </w:tc>
+        <w:tc>
+          <w:tcPr>
+            <w:tcW w:type="dxa" w:w="5717"/>
+          </w:tcPr>
+          <w:p>
+            <w:r>
+              <w:t>NOT_APPLICABLE unless the current page declares an image/video/preview ratio; when declared, the exact current ratio remains authoritative.</w:t>
+            </w:r>
+          </w:p>
+        </w:tc>
+      </w:tr>
+      <w:tr>
+        <w:tc>
+          <w:tcPr>
+            <w:tcW w:type="dxa" w:w="5717"/>
+          </w:tcPr>
+          <w:p>
+            <w:r>
+              <w:t>Overflow / Scroll Rule</w:t>
+            </w:r>
+          </w:p>
+        </w:tc>
+        <w:tc>
+          <w:tcPr>
+            <w:tcW w:type="dxa" w:w="5717"/>
+          </w:tcPr>
+          <w:p>
+            <w:r>
+              <w:t>No hidden overflow for actionable content. Long technical values use existing ellipsis + tooltip/drawer rule; large tables may use the current controlled horizontal-scroll rule.</w:t>
+            </w:r>
+          </w:p>
+        </w:tc>
+      </w:tr>
+      <w:tr>
+        <w:tc>
+          <w:tcPr>
+            <w:tcW w:type="dxa" w:w="5717"/>
+          </w:tcPr>
+          <w:p>
+            <w:r>
+              <w:t>Collapse / Stack / Wrap Rule</w:t>
+            </w:r>
+          </w:p>
+        </w:tc>
+        <w:tc>
+          <w:tcPr>
+            <w:tcW w:type="dxa" w:w="5717"/>
+          </w:tcPr>
+          <w:p>
+            <w:r>
+              <w:t>Reflow may stack/collapse only within the current responsive contract; semantic order, required adjacency and operation order MUST NOT change.</w:t>
+            </w:r>
+          </w:p>
+        </w:tc>
+      </w:tr>
+      <w:tr>
+        <w:tc>
+          <w:tcPr>
+            <w:tcW w:type="dxa" w:w="5717"/>
+          </w:tcPr>
+          <w:p>
+            <w:r>
+              <w:t>Z-order / Overlay Rule</w:t>
+            </w:r>
+          </w:p>
+        </w:tc>
+        <w:tc>
+          <w:tcPr>
+            <w:tcW w:type="dxa" w:w="5717"/>
+          </w:tcPr>
+          <w:p>
+            <w:r>
+              <w:t>Global Header / Sidebar overlay / Dialog / Drawer layers remain above Workspace without blocking required content; overlay expansion MUST NOT reflow the primary Workspace unless explicitly specified.</w:t>
+            </w:r>
+          </w:p>
+        </w:tc>
+      </w:tr>
+      <w:tr>
+        <w:tc>
+          <w:tcPr>
+            <w:tcW w:type="dxa" w:w="5717"/>
+          </w:tcPr>
+          <w:p>
+            <w:r>
+              <w:t>Text Capacity / Truncation / Wrap Rule</w:t>
+            </w:r>
+          </w:p>
+        </w:tc>
+        <w:tc>
+          <w:tcPr>
+            <w:tcW w:type="dxa" w:w="5717"/>
+          </w:tcPr>
+          <w:p>
+            <w:r>
+              <w:t>Required labels/status/error text may not be clipped. Long IDs/technical values use controlled ellipsis with recoverable full value; no silent semantic truncation.</w:t>
+            </w:r>
+          </w:p>
+        </w:tc>
+      </w:tr>
+      <w:tr>
+        <w:tc>
+          <w:tcPr>
+            <w:tcW w:type="dxa" w:w="5717"/>
+          </w:tcPr>
+          <w:p>
+            <w:r>
+              <w:t>Asset Object-fit / Object-position</w:t>
+            </w:r>
+          </w:p>
+        </w:tc>
+        <w:tc>
+          <w:tcPr>
+            <w:tcW w:type="dxa" w:w="5717"/>
+          </w:tcPr>
+          <w:p>
+            <w:r>
+              <w:t>REFERENCE_ONLY → current Asset Binding owner when a formal visual asset exists; otherwise NOT_APPLICABLE.</w:t>
+            </w:r>
+          </w:p>
+        </w:tc>
+      </w:tr>
+      <w:tr>
+        <w:tc>
+          <w:tcPr>
+            <w:tcW w:type="dxa" w:w="5717"/>
+          </w:tcPr>
+          <w:p>
+            <w:r>
+              <w:t>Locked Visual Anchors</w:t>
+            </w:r>
+          </w:p>
+        </w:tc>
+        <w:tc>
+          <w:tcPr>
+            <w:tcW w:type="dxa" w:w="5717"/>
+          </w:tcPr>
+          <w:p>
+            <w:r>
+              <w:t>Bound to the Visual Anchor Registry in this annex; unlisted regions are not implicitly editable.</w:t>
+            </w:r>
+          </w:p>
+        </w:tc>
+      </w:tr>
+      <w:tr>
+        <w:tc>
+          <w:tcPr>
+            <w:tcW w:type="dxa" w:w="5717"/>
+          </w:tcPr>
+          <w:p>
+            <w:r>
+              <w:t>Allowed Tolerance / Diff Threshold</w:t>
+            </w:r>
+          </w:p>
+        </w:tc>
+        <w:tc>
+          <w:tcPr>
+            <w:tcW w:type="dxa" w:w="5717"/>
+          </w:tcPr>
+          <w:p>
+            <w:r>
+              <w:t>Locked anchors and structural grid: zero unapproved drift. Token-level micro adjustment is allowed only inside current Design Token/Layout rules; structural changes require Change Set + re-review.</w:t>
+            </w:r>
+          </w:p>
+        </w:tc>
+      </w:tr>
+      <w:tr>
+        <w:tc>
+          <w:tcPr>
+            <w:tcW w:type="dxa" w:w="5717"/>
+          </w:tcPr>
+          <w:p>
+            <w:r>
+              <w:t>Geometry Failure Set</w:t>
+            </w:r>
+          </w:p>
+        </w:tc>
+        <w:tc>
+          <w:tcPr>
+            <w:tcW w:type="dxa" w:w="5717"/>
+          </w:tcPr>
+          <w:p>
+            <w:r>
+              <w:t>Detect overlap, clipping, horizontal overflow, unapproved scroll, control compression, unexpected wrap/stack, aspect drift, misalignment, sticky/fixed occlusion and header/sidebar/workspace collision.</w:t>
             </w:r>
           </w:p>
         </w:tc>

</xml_diff>

<commit_message>
style(acpos): compact planning design annex pagination
</commit_message>
<xml_diff>
--- a/ACPOS_DB-01_MOTHER_BASIC_DESIGN_TECH_PURPLE_v1.0.docx
+++ b/ACPOS_DB-01_MOTHER_BASIC_DESIGN_TECH_PURPLE_v1.0.docx
@@ -35843,6 +35843,9 @@
       </w:r>
     </w:p>
     <w:p>
+      <w:pPr>
+        <w:spacing w:before="0" w:after="0" w:line="240" w:lineRule="auto"/>
+      </w:pPr>
       <w:r>
         <w:t>[ACPOS-20260922-PLANNING-DESIGN-CLOSURE-ANNEX-V1]</w:t>
       </w:r>
@@ -35853,12 +35856,19 @@
     <w:p>
       <w:pPr>
         <w:pStyle w:val="Heading2"/>
+        <w:spacing w:before="0" w:after="0" w:line="240" w:lineRule="auto"/>
       </w:pPr>
       <w:r>
+        <w:rPr>
+          <w:sz w:val="21"/>
+        </w:rPr>
         <w:t>Requirement Definition Gate Closure｜需求定義補齊</w:t>
       </w:r>
     </w:p>
     <w:p>
+      <w:pPr>
+        <w:spacing w:before="0" w:after="0" w:line="240" w:lineRule="auto"/>
+      </w:pPr>
       <w:r>
         <w:t>[ACPOS-DESIGN-CLOSURE:DB-01:REQUIREMENTS]</w:t>
       </w:r>
@@ -35874,12 +35884,21 @@
         <w:gridCol w:w="5717"/>
       </w:tblGrid>
       <w:tr>
+        <w:trPr>
+          <w:cantSplit/>
+        </w:trPr>
         <w:tc>
           <w:tcPr>
             <w:tcW w:type="dxa" w:w="5717"/>
           </w:tcPr>
           <w:p>
-            <w:r>
+            <w:pPr>
+              <w:spacing w:before="0" w:after="0" w:line="240" w:lineRule="auto"/>
+            </w:pPr>
+            <w:r>
+              <w:rPr>
+                <w:sz w:val="16"/>
+              </w:rPr>
               <w:t>Design Item / 設計項目</w:t>
             </w:r>
           </w:p>
@@ -35889,19 +35908,34 @@
             <w:tcW w:type="dxa" w:w="5717"/>
           </w:tcPr>
           <w:p>
-            <w:r>
+            <w:pPr>
+              <w:spacing w:before="0" w:after="0" w:line="240" w:lineRule="auto"/>
+            </w:pPr>
+            <w:r>
+              <w:rPr>
+                <w:sz w:val="16"/>
+              </w:rPr>
               <w:t>Canonical Planning Design Contract / 正式規劃設計契約</w:t>
             </w:r>
           </w:p>
         </w:tc>
       </w:tr>
       <w:tr>
+        <w:trPr>
+          <w:cantSplit/>
+        </w:trPr>
         <w:tc>
           <w:tcPr>
             <w:tcW w:type="dxa" w:w="5717"/>
           </w:tcPr>
           <w:p>
-            <w:r>
+            <w:pPr>
+              <w:spacing w:before="0" w:after="0" w:line="240" w:lineRule="auto"/>
+            </w:pPr>
+            <w:r>
+              <w:rPr>
+                <w:sz w:val="16"/>
+              </w:rPr>
               <w:t>Project Scope</w:t>
             </w:r>
           </w:p>
@@ -35911,19 +35945,34 @@
             <w:tcW w:type="dxa" w:w="5717"/>
           </w:tcPr>
           <w:p>
-            <w:r>
+            <w:pPr>
+              <w:spacing w:before="0" w:after="0" w:line="240" w:lineRule="auto"/>
+            </w:pPr>
+            <w:r>
+              <w:rPr>
+                <w:sz w:val="16"/>
+              </w:rPr>
               <w:t>DB-01／資料模型／資料庫治理 current Word planning/basic-design scope；僅補設計規範，不改變已存在產品 Authority。</w:t>
             </w:r>
           </w:p>
         </w:tc>
       </w:tr>
       <w:tr>
+        <w:trPr>
+          <w:cantSplit/>
+        </w:trPr>
         <w:tc>
           <w:tcPr>
             <w:tcW w:type="dxa" w:w="5717"/>
           </w:tcPr>
           <w:p>
-            <w:r>
+            <w:pPr>
+              <w:spacing w:before="0" w:after="0" w:line="240" w:lineRule="auto"/>
+            </w:pPr>
+            <w:r>
+              <w:rPr>
+                <w:sz w:val="16"/>
+              </w:rPr>
               <w:t>Business Goal</w:t>
             </w:r>
           </w:p>
@@ -35933,19 +35982,34 @@
             <w:tcW w:type="dxa" w:w="5717"/>
           </w:tcPr>
           <w:p>
-            <w:r>
+            <w:pPr>
+              <w:spacing w:before="0" w:after="0" w:line="240" w:lineRule="auto"/>
+            </w:pPr>
+            <w:r>
+              <w:rPr>
+                <w:sz w:val="16"/>
+              </w:rPr>
               <w:t>以單一治理視角呈現 ACPOS canonical data model、exact version lineage、relationships、schema/migration history、integrity findings 與 audit，供受權限限制的管理／Debug Viewer 使用。</w:t>
             </w:r>
           </w:p>
         </w:tc>
       </w:tr>
       <w:tr>
+        <w:trPr>
+          <w:cantSplit/>
+        </w:trPr>
         <w:tc>
           <w:tcPr>
             <w:tcW w:type="dxa" w:w="5717"/>
           </w:tcPr>
           <w:p>
-            <w:r>
+            <w:pPr>
+              <w:spacing w:before="0" w:after="0" w:line="240" w:lineRule="auto"/>
+            </w:pPr>
+            <w:r>
+              <w:rPr>
+                <w:sz w:val="16"/>
+              </w:rPr>
               <w:t>Target User / Role Definition</w:t>
             </w:r>
           </w:p>
@@ -35955,19 +36019,34 @@
             <w:tcW w:type="dxa" w:w="5717"/>
           </w:tcPr>
           <w:p>
-            <w:r>
+            <w:pPr>
+              <w:spacing w:before="0" w:after="0" w:line="240" w:lineRule="auto"/>
+            </w:pPr>
+            <w:r>
+              <w:rPr>
+                <w:sz w:val="16"/>
+              </w:rPr>
               <w:t>具 DB-01 read/debug/governance 權限的內部管理者、系統工程或資料治理人員。</w:t>
             </w:r>
           </w:p>
         </w:tc>
       </w:tr>
       <w:tr>
+        <w:trPr>
+          <w:cantSplit/>
+        </w:trPr>
         <w:tc>
           <w:tcPr>
             <w:tcW w:type="dxa" w:w="5717"/>
           </w:tcPr>
           <w:p>
-            <w:r>
+            <w:pPr>
+              <w:spacing w:before="0" w:after="0" w:line="240" w:lineRule="auto"/>
+            </w:pPr>
+            <w:r>
+              <w:rPr>
+                <w:sz w:val="16"/>
+              </w:rPr>
               <w:t>Functional Requirements</w:t>
             </w:r>
           </w:p>
@@ -35977,19 +36056,34 @@
             <w:tcW w:type="dxa" w:w="5717"/>
           </w:tcPr>
           <w:p>
-            <w:r>
+            <w:pPr>
+              <w:spacing w:before="0" w:after="0" w:line="240" w:lineRule="auto"/>
+            </w:pPr>
+            <w:r>
+              <w:rPr>
+                <w:sz w:val="16"/>
+              </w:rPr>
               <w:t>查看 canonical model、relationship、version lineage、schema/migration history、integrity finding、audit/traceability；任何 effectful 行為仍只可使用既有 exact Operation。</w:t>
             </w:r>
           </w:p>
         </w:tc>
       </w:tr>
       <w:tr>
+        <w:trPr>
+          <w:cantSplit/>
+        </w:trPr>
         <w:tc>
           <w:tcPr>
             <w:tcW w:type="dxa" w:w="5717"/>
           </w:tcPr>
           <w:p>
-            <w:r>
+            <w:pPr>
+              <w:spacing w:before="0" w:after="0" w:line="240" w:lineRule="auto"/>
+            </w:pPr>
+            <w:r>
+              <w:rPr>
+                <w:sz w:val="16"/>
+              </w:rPr>
               <w:t>Non-functional Requirements</w:t>
             </w:r>
           </w:p>
@@ -35999,19 +36093,34 @@
             <w:tcW w:type="dxa" w:w="5717"/>
           </w:tcPr>
           <w:p>
-            <w:r>
+            <w:pPr>
+              <w:spacing w:before="0" w:after="0" w:line="240" w:lineRule="auto"/>
+            </w:pPr>
+            <w:r>
+              <w:rPr>
+                <w:sz w:val="16"/>
+              </w:rPr>
               <w:t>Read-first、Fail Closed、Real Data Only、Exact Version、Traceability；缺 Authority 時顯示 gap，不合成 schema。</w:t>
             </w:r>
           </w:p>
         </w:tc>
       </w:tr>
       <w:tr>
+        <w:trPr>
+          <w:cantSplit/>
+        </w:trPr>
         <w:tc>
           <w:tcPr>
             <w:tcW w:type="dxa" w:w="5717"/>
           </w:tcPr>
           <w:p>
-            <w:r>
+            <w:pPr>
+              <w:spacing w:before="0" w:after="0" w:line="240" w:lineRule="auto"/>
+            </w:pPr>
+            <w:r>
+              <w:rPr>
+                <w:sz w:val="16"/>
+              </w:rPr>
               <w:t>Out-of-Scope Definition</w:t>
             </w:r>
           </w:p>
@@ -36021,19 +36130,34 @@
             <w:tcW w:type="dxa" w:w="5717"/>
           </w:tcPr>
           <w:p>
-            <w:r>
+            <w:pPr>
+              <w:spacing w:before="0" w:after="0" w:line="240" w:lineRule="auto"/>
+            </w:pPr>
+            <w:r>
+              <w:rPr>
+                <w:sz w:val="16"/>
+              </w:rPr>
               <w:t>禁止建立第二套 DB owner、禁止由 Viewer 猜測 schema/relationship、禁止以文件補寫未授權資料 mutation。</w:t>
             </w:r>
           </w:p>
         </w:tc>
       </w:tr>
       <w:tr>
+        <w:trPr>
+          <w:cantSplit/>
+        </w:trPr>
         <w:tc>
           <w:tcPr>
             <w:tcW w:type="dxa" w:w="5717"/>
           </w:tcPr>
           <w:p>
-            <w:r>
+            <w:pPr>
+              <w:spacing w:before="0" w:after="0" w:line="240" w:lineRule="auto"/>
+            </w:pPr>
+            <w:r>
+              <w:rPr>
+                <w:sz w:val="16"/>
+              </w:rPr>
               <w:t>Glossary</w:t>
             </w:r>
           </w:p>
@@ -36043,19 +36167,34 @@
             <w:tcW w:type="dxa" w:w="5717"/>
           </w:tcPr>
           <w:p>
-            <w:r>
+            <w:pPr>
+              <w:spacing w:before="0" w:after="0" w:line="240" w:lineRule="auto"/>
+            </w:pPr>
+            <w:r>
+              <w:rPr>
+                <w:sz w:val="16"/>
+              </w:rPr>
               <w:t>DB-01 使用本文既有 Entity / Operation / State / Owner / Evidence / Version 名詞；同義詞不得建立第二 identity。</w:t>
             </w:r>
           </w:p>
         </w:tc>
       </w:tr>
       <w:tr>
+        <w:trPr>
+          <w:cantSplit/>
+        </w:trPr>
         <w:tc>
           <w:tcPr>
             <w:tcW w:type="dxa" w:w="5717"/>
           </w:tcPr>
           <w:p>
-            <w:r>
+            <w:pPr>
+              <w:spacing w:before="0" w:after="0" w:line="240" w:lineRule="auto"/>
+            </w:pPr>
+            <w:r>
+              <w:rPr>
+                <w:sz w:val="16"/>
+              </w:rPr>
               <w:t>Naming Registry Initial State</w:t>
             </w:r>
           </w:p>
@@ -36065,19 +36204,34 @@
             <w:tcW w:type="dxa" w:w="5717"/>
           </w:tcPr>
           <w:p>
-            <w:r>
+            <w:pPr>
+              <w:spacing w:before="0" w:after="0" w:line="240" w:lineRule="auto"/>
+            </w:pPr>
+            <w:r>
+              <w:rPr>
+                <w:sz w:val="16"/>
+              </w:rPr>
               <w:t>Page UID=DB-01；Owner File=ACPOS_DB-01_MOTHER_BASIC_DESIGN_TECH_PURPLE_v1.0.docx；Current canonical filename only；禁止 copy/backup/alternate owner。</w:t>
             </w:r>
           </w:p>
         </w:tc>
       </w:tr>
       <w:tr>
+        <w:trPr>
+          <w:cantSplit/>
+        </w:trPr>
         <w:tc>
           <w:tcPr>
             <w:tcW w:type="dxa" w:w="5717"/>
           </w:tcPr>
           <w:p>
-            <w:r>
+            <w:pPr>
+              <w:spacing w:before="0" w:after="0" w:line="240" w:lineRule="auto"/>
+            </w:pPr>
+            <w:r>
+              <w:rPr>
+                <w:sz w:val="16"/>
+              </w:rPr>
               <w:t>Authority</w:t>
             </w:r>
           </w:p>
@@ -36087,7 +36241,13 @@
             <w:tcW w:type="dxa" w:w="5717"/>
           </w:tcPr>
           <w:p>
-            <w:r>
+            <w:pPr>
+              <w:spacing w:before="0" w:after="0" w:line="240" w:lineRule="auto"/>
+            </w:pPr>
+            <w:r>
+              <w:rPr>
+                <w:sz w:val="16"/>
+              </w:rPr>
               <w:t>Current DB-01 Word + Mother 01→04；缺產品選擇時 BLOCK，不由本附錄猜測。</w:t>
             </w:r>
           </w:p>
@@ -36097,12 +36257,19 @@
     <w:p>
       <w:pPr>
         <w:pStyle w:val="Heading2"/>
+        <w:spacing w:before="0" w:after="0" w:line="240" w:lineRule="auto"/>
       </w:pPr>
       <w:r>
+        <w:rPr>
+          <w:sz w:val="21"/>
+        </w:rPr>
         <w:t>Design System / Layout Closure｜設計系統與版面補齊</w:t>
       </w:r>
     </w:p>
     <w:p>
+      <w:pPr>
+        <w:spacing w:before="0" w:after="0" w:line="240" w:lineRule="auto"/>
+      </w:pPr>
       <w:r>
         <w:t>[ACPOS-DESIGN-CLOSURE:DB-01:DESIGN-SYSTEM]</w:t>
       </w:r>
@@ -36118,12 +36285,21 @@
         <w:gridCol w:w="5717"/>
       </w:tblGrid>
       <w:tr>
+        <w:trPr>
+          <w:cantSplit/>
+        </w:trPr>
         <w:tc>
           <w:tcPr>
             <w:tcW w:type="dxa" w:w="5717"/>
           </w:tcPr>
           <w:p>
-            <w:r>
+            <w:pPr>
+              <w:spacing w:before="0" w:after="0" w:line="240" w:lineRule="auto"/>
+            </w:pPr>
+            <w:r>
+              <w:rPr>
+                <w:sz w:val="16"/>
+              </w:rPr>
               <w:t>Design Item / 設計項目</w:t>
             </w:r>
           </w:p>
@@ -36133,19 +36309,34 @@
             <w:tcW w:type="dxa" w:w="5717"/>
           </w:tcPr>
           <w:p>
-            <w:r>
+            <w:pPr>
+              <w:spacing w:before="0" w:after="0" w:line="240" w:lineRule="auto"/>
+            </w:pPr>
+            <w:r>
+              <w:rPr>
+                <w:sz w:val="16"/>
+              </w:rPr>
               <w:t>Canonical Planning Design Contract / 正式規劃設計契約</w:t>
             </w:r>
           </w:p>
         </w:tc>
       </w:tr>
       <w:tr>
+        <w:trPr>
+          <w:cantSplit/>
+        </w:trPr>
         <w:tc>
           <w:tcPr>
             <w:tcW w:type="dxa" w:w="5717"/>
           </w:tcPr>
           <w:p>
-            <w:r>
+            <w:pPr>
+              <w:spacing w:before="0" w:after="0" w:line="240" w:lineRule="auto"/>
+            </w:pPr>
+            <w:r>
+              <w:rPr>
+                <w:sz w:val="16"/>
+              </w:rPr>
               <w:t>Color Tokens</w:t>
             </w:r>
           </w:p>
@@ -36155,19 +36346,34 @@
             <w:tcW w:type="dxa" w:w="5717"/>
           </w:tcPr>
           <w:p>
-            <w:r>
+            <w:pPr>
+              <w:spacing w:before="0" w:after="0" w:line="240" w:lineRule="auto"/>
+            </w:pPr>
+            <w:r>
+              <w:rPr>
+                <w:sz w:val="16"/>
+              </w:rPr>
               <w:t>SHARED_OWNER_REFERENCE → current Global Home / Shell Design System tech-purple token set; existing page-local approved override, if any, remains authoritative.</w:t>
             </w:r>
           </w:p>
         </w:tc>
       </w:tr>
       <w:tr>
+        <w:trPr>
+          <w:cantSplit/>
+        </w:trPr>
         <w:tc>
           <w:tcPr>
             <w:tcW w:type="dxa" w:w="5717"/>
           </w:tcPr>
           <w:p>
-            <w:r>
+            <w:pPr>
+              <w:spacing w:before="0" w:after="0" w:line="240" w:lineRule="auto"/>
+            </w:pPr>
+            <w:r>
+              <w:rPr>
+                <w:sz w:val="16"/>
+              </w:rPr>
               <w:t>Typography Tokens</w:t>
             </w:r>
           </w:p>
@@ -36177,19 +36383,34 @@
             <w:tcW w:type="dxa" w:w="5717"/>
           </w:tcPr>
           <w:p>
-            <w:r>
+            <w:pPr>
+              <w:spacing w:before="0" w:after="0" w:line="240" w:lineRule="auto"/>
+            </w:pPr>
+            <w:r>
+              <w:rPr>
+                <w:sz w:val="16"/>
+              </w:rPr>
               <w:t>SHARED_OWNER_REFERENCE → current Global Design System typography; page-local text hierarchy may only use registered heading/body/label/technical text roles.</w:t>
             </w:r>
           </w:p>
         </w:tc>
       </w:tr>
       <w:tr>
+        <w:trPr>
+          <w:cantSplit/>
+        </w:trPr>
         <w:tc>
           <w:tcPr>
             <w:tcW w:type="dxa" w:w="5717"/>
           </w:tcPr>
           <w:p>
-            <w:r>
+            <w:pPr>
+              <w:spacing w:before="0" w:after="0" w:line="240" w:lineRule="auto"/>
+            </w:pPr>
+            <w:r>
+              <w:rPr>
+                <w:sz w:val="16"/>
+              </w:rPr>
               <w:t>Spacing Tokens</w:t>
             </w:r>
           </w:p>
@@ -36199,19 +36420,34 @@
             <w:tcW w:type="dxa" w:w="5717"/>
           </w:tcPr>
           <w:p>
-            <w:r>
+            <w:pPr>
+              <w:spacing w:before="0" w:after="0" w:line="240" w:lineRule="auto"/>
+            </w:pPr>
+            <w:r>
+              <w:rPr>
+                <w:sz w:val="16"/>
+              </w:rPr>
               <w:t>Use registered gap/padding/spacing tokens; existing exact page gaps remain authoritative; no ad-hoc pixel drift.</w:t>
             </w:r>
           </w:p>
         </w:tc>
       </w:tr>
       <w:tr>
+        <w:trPr>
+          <w:cantSplit/>
+        </w:trPr>
         <w:tc>
           <w:tcPr>
             <w:tcW w:type="dxa" w:w="5717"/>
           </w:tcPr>
           <w:p>
-            <w:r>
+            <w:pPr>
+              <w:spacing w:before="0" w:after="0" w:line="240" w:lineRule="auto"/>
+            </w:pPr>
+            <w:r>
+              <w:rPr>
+                <w:sz w:val="16"/>
+              </w:rPr>
               <w:t>Component States</w:t>
             </w:r>
           </w:p>
@@ -36221,19 +36457,34 @@
             <w:tcW w:type="dxa" w:w="5717"/>
           </w:tcPr>
           <w:p>
-            <w:r>
+            <w:pPr>
+              <w:spacing w:before="0" w:after="0" w:line="240" w:lineRule="auto"/>
+            </w:pPr>
+            <w:r>
+              <w:rPr>
+                <w:sz w:val="16"/>
+              </w:rPr>
               <w:t>Default / Hover / Focus / Active / Loading / Disabled / Success / Error MUST NOT change the approved component footprint unless the current component contract explicitly allows it.</w:t>
             </w:r>
           </w:p>
         </w:tc>
       </w:tr>
       <w:tr>
+        <w:trPr>
+          <w:cantSplit/>
+        </w:trPr>
         <w:tc>
           <w:tcPr>
             <w:tcW w:type="dxa" w:w="5717"/>
           </w:tcPr>
           <w:p>
-            <w:r>
+            <w:pPr>
+              <w:spacing w:before="0" w:after="0" w:line="240" w:lineRule="auto"/>
+            </w:pPr>
+            <w:r>
+              <w:rPr>
+                <w:sz w:val="16"/>
+              </w:rPr>
               <w:t>Primary Layout</w:t>
             </w:r>
           </w:p>
@@ -36243,19 +36494,34 @@
             <w:tcW w:type="dxa" w:w="5717"/>
           </w:tcPr>
           <w:p>
-            <w:r>
+            <w:pPr>
+              <w:spacing w:before="0" w:after="0" w:line="240" w:lineRule="auto"/>
+            </w:pPr>
+            <w:r>
+              <w:rPr>
+                <w:sz w:val="16"/>
+              </w:rPr>
               <w:t>Use this Word's existing Primary Grid / Section / Workspace layout as the page-local authority; this annex introduces no second grid.</w:t>
             </w:r>
           </w:p>
         </w:tc>
       </w:tr>
       <w:tr>
+        <w:trPr>
+          <w:cantSplit/>
+        </w:trPr>
         <w:tc>
           <w:tcPr>
             <w:tcW w:type="dxa" w:w="5717"/>
           </w:tcPr>
           <w:p>
-            <w:r>
+            <w:pPr>
+              <w:spacing w:before="0" w:after="0" w:line="240" w:lineRule="auto"/>
+            </w:pPr>
+            <w:r>
+              <w:rPr>
+                <w:sz w:val="16"/>
+              </w:rPr>
               <w:t>Navigation Region</w:t>
             </w:r>
           </w:p>
@@ -36265,19 +36531,34 @@
             <w:tcW w:type="dxa" w:w="5717"/>
           </w:tcPr>
           <w:p>
-            <w:r>
+            <w:pPr>
+              <w:spacing w:before="0" w:after="0" w:line="240" w:lineRule="auto"/>
+            </w:pPr>
+            <w:r>
+              <w:rPr>
+                <w:sz w:val="16"/>
+              </w:rPr>
               <w:t>Global Header and collapsible/overlay Sidebar remain shared shell regions; page Workspace starts in the registered content region.</w:t>
             </w:r>
           </w:p>
         </w:tc>
       </w:tr>
       <w:tr>
+        <w:trPr>
+          <w:cantSplit/>
+        </w:trPr>
         <w:tc>
           <w:tcPr>
             <w:tcW w:type="dxa" w:w="5717"/>
           </w:tcPr>
           <w:p>
-            <w:r>
+            <w:pPr>
+              <w:spacing w:before="0" w:after="0" w:line="240" w:lineRule="auto"/>
+            </w:pPr>
+            <w:r>
+              <w:rPr>
+                <w:sz w:val="16"/>
+              </w:rPr>
               <w:t>Responsive Behavior</w:t>
             </w:r>
           </w:p>
@@ -36287,19 +36568,34 @@
             <w:tcW w:type="dxa" w:w="5717"/>
           </w:tcPr>
           <w:p>
-            <w:r>
+            <w:pPr>
+              <w:spacing w:before="0" w:after="0" w:line="240" w:lineRule="auto"/>
+            </w:pPr>
+            <w:r>
+              <w:rPr>
+                <w:sz w:val="16"/>
+              </w:rPr>
               <w:t>Use the current page responsive rule and shared shell breakpoint owner; semantic order and functional topology MUST remain stable across reflow.</w:t>
             </w:r>
           </w:p>
         </w:tc>
       </w:tr>
       <w:tr>
+        <w:trPr>
+          <w:cantSplit/>
+        </w:trPr>
         <w:tc>
           <w:tcPr>
             <w:tcW w:type="dxa" w:w="5717"/>
           </w:tcPr>
           <w:p>
-            <w:r>
+            <w:pPr>
+              <w:spacing w:before="0" w:after="0" w:line="240" w:lineRule="auto"/>
+            </w:pPr>
+            <w:r>
+              <w:rPr>
+                <w:sz w:val="16"/>
+              </w:rPr>
               <w:t>Design Ownership</w:t>
             </w:r>
           </w:p>
@@ -36309,7 +36605,13 @@
             <w:tcW w:type="dxa" w:w="5717"/>
           </w:tcPr>
           <w:p>
-            <w:r>
+            <w:pPr>
+              <w:spacing w:before="0" w:after="0" w:line="240" w:lineRule="auto"/>
+            </w:pPr>
+            <w:r>
+              <w:rPr>
+                <w:sz w:val="16"/>
+              </w:rPr>
               <w:t>Page owns page-local layout/components; Global Shell owns shared header/sidebar/tokens; references only, no duplicated shared payload.</w:t>
             </w:r>
           </w:p>
@@ -36319,12 +36621,19 @@
     <w:p>
       <w:pPr>
         <w:pStyle w:val="Heading2"/>
+        <w:spacing w:before="0" w:after="0" w:line="240" w:lineRule="auto"/>
       </w:pPr>
       <w:r>
+        <w:rPr>
+          <w:sz w:val="21"/>
+        </w:rPr>
         <w:t>Visual Geometry Contract Closure｜視覺幾何補齊</w:t>
       </w:r>
     </w:p>
     <w:p>
+      <w:pPr>
+        <w:spacing w:before="0" w:after="0" w:line="240" w:lineRule="auto"/>
+      </w:pPr>
       <w:r>
         <w:t>[ACPOS-DESIGN-CLOSURE:DB-01:GEOMETRY]</w:t>
       </w:r>
@@ -36340,12 +36649,21 @@
         <w:gridCol w:w="5717"/>
       </w:tblGrid>
       <w:tr>
+        <w:trPr>
+          <w:cantSplit/>
+        </w:trPr>
         <w:tc>
           <w:tcPr>
             <w:tcW w:type="dxa" w:w="5717"/>
           </w:tcPr>
           <w:p>
-            <w:r>
+            <w:pPr>
+              <w:spacing w:before="0" w:after="0" w:line="240" w:lineRule="auto"/>
+            </w:pPr>
+            <w:r>
+              <w:rPr>
+                <w:sz w:val="16"/>
+              </w:rPr>
               <w:t>Design Item / 設計項目</w:t>
             </w:r>
           </w:p>
@@ -36355,19 +36673,34 @@
             <w:tcW w:type="dxa" w:w="5717"/>
           </w:tcPr>
           <w:p>
-            <w:r>
+            <w:pPr>
+              <w:spacing w:before="0" w:after="0" w:line="240" w:lineRule="auto"/>
+            </w:pPr>
+            <w:r>
+              <w:rPr>
+                <w:sz w:val="16"/>
+              </w:rPr>
               <w:t>Canonical Planning Design Contract / 正式規劃設計契約</w:t>
             </w:r>
           </w:p>
         </w:tc>
       </w:tr>
       <w:tr>
+        <w:trPr>
+          <w:cantSplit/>
+        </w:trPr>
         <w:tc>
           <w:tcPr>
             <w:tcW w:type="dxa" w:w="5717"/>
           </w:tcPr>
           <w:p>
-            <w:r>
+            <w:pPr>
+              <w:spacing w:before="0" w:after="0" w:line="240" w:lineRule="auto"/>
+            </w:pPr>
+            <w:r>
+              <w:rPr>
+                <w:sz w:val="16"/>
+              </w:rPr>
               <w:t>Viewport / Breakpoint UID</w:t>
             </w:r>
           </w:p>
@@ -36377,19 +36710,34 @@
             <w:tcW w:type="dxa" w:w="5717"/>
           </w:tcPr>
           <w:p>
-            <w:r>
+            <w:pPr>
+              <w:spacing w:before="0" w:after="0" w:line="240" w:lineRule="auto"/>
+            </w:pPr>
+            <w:r>
+              <w:rPr>
+                <w:sz w:val="16"/>
+              </w:rPr>
               <w:t>SHARED_OWNER_REFERENCE → current Global Home breakpoint contract; page-specific breakpoint/reflow rules in this Word override only where explicitly registered.</w:t>
             </w:r>
           </w:p>
         </w:tc>
       </w:tr>
       <w:tr>
+        <w:trPr>
+          <w:cantSplit/>
+        </w:trPr>
         <w:tc>
           <w:tcPr>
             <w:tcW w:type="dxa" w:w="5717"/>
           </w:tcPr>
           <w:p>
-            <w:r>
+            <w:pPr>
+              <w:spacing w:before="0" w:after="0" w:line="240" w:lineRule="auto"/>
+            </w:pPr>
+            <w:r>
+              <w:rPr>
+                <w:sz w:val="16"/>
+              </w:rPr>
               <w:t>Container Width / Min / Max</w:t>
             </w:r>
           </w:p>
@@ -36399,19 +36747,34 @@
             <w:tcW w:type="dxa" w:w="5717"/>
           </w:tcPr>
           <w:p>
-            <w:r>
+            <w:pPr>
+              <w:spacing w:before="0" w:after="0" w:line="240" w:lineRule="auto"/>
+            </w:pPr>
+            <w:r>
+              <w:rPr>
+                <w:sz w:val="16"/>
+              </w:rPr>
               <w:t>Retain current Global Shell + page Primary Grid width contract. No page-local implicit width may override an existing exact dimension.</w:t>
             </w:r>
           </w:p>
         </w:tc>
       </w:tr>
       <w:tr>
+        <w:trPr>
+          <w:cantSplit/>
+        </w:trPr>
         <w:tc>
           <w:tcPr>
             <w:tcW w:type="dxa" w:w="5717"/>
           </w:tcPr>
           <w:p>
-            <w:r>
+            <w:pPr>
+              <w:spacing w:before="0" w:after="0" w:line="240" w:lineRule="auto"/>
+            </w:pPr>
+            <w:r>
+              <w:rPr>
+                <w:sz w:val="16"/>
+              </w:rPr>
               <w:t>Grid Columns / Span / Gutter / Outer Margin</w:t>
             </w:r>
           </w:p>
@@ -36421,19 +36784,34 @@
             <w:tcW w:type="dxa" w:w="5717"/>
           </w:tcPr>
           <w:p>
-            <w:r>
+            <w:pPr>
+              <w:spacing w:before="0" w:after="0" w:line="240" w:lineRule="auto"/>
+            </w:pPr>
+            <w:r>
+              <w:rPr>
+                <w:sz w:val="16"/>
+              </w:rPr>
               <w:t>Use the existing page Primary Grid / section mapping and current gap/margin values; any structural grid change requires Change Set.</w:t>
             </w:r>
           </w:p>
         </w:tc>
       </w:tr>
       <w:tr>
+        <w:trPr>
+          <w:cantSplit/>
+        </w:trPr>
         <w:tc>
           <w:tcPr>
             <w:tcW w:type="dxa" w:w="5717"/>
           </w:tcPr>
           <w:p>
-            <w:r>
+            <w:pPr>
+              <w:spacing w:before="0" w:after="0" w:line="240" w:lineRule="auto"/>
+            </w:pPr>
+            <w:r>
+              <w:rPr>
+                <w:sz w:val="16"/>
+              </w:rPr>
               <w:t>Section Bounding Rules</w:t>
             </w:r>
           </w:p>
@@ -36443,19 +36821,34 @@
             <w:tcW w:type="dxa" w:w="5717"/>
           </w:tcPr>
           <w:p>
-            <w:r>
+            <w:pPr>
+              <w:spacing w:before="0" w:after="0" w:line="240" w:lineRule="auto"/>
+            </w:pPr>
+            <w:r>
+              <w:rPr>
+                <w:sz w:val="16"/>
+              </w:rPr>
               <w:t>Every registered Section remains within its current Workspace region; sticky/fixed/overlay areas MUST NOT occlude required controls.</w:t>
             </w:r>
           </w:p>
         </w:tc>
       </w:tr>
       <w:tr>
+        <w:trPr>
+          <w:cantSplit/>
+        </w:trPr>
         <w:tc>
           <w:tcPr>
             <w:tcW w:type="dxa" w:w="5717"/>
           </w:tcPr>
           <w:p>
-            <w:r>
+            <w:pPr>
+              <w:spacing w:before="0" w:after="0" w:line="240" w:lineRule="auto"/>
+            </w:pPr>
+            <w:r>
+              <w:rPr>
+                <w:sz w:val="16"/>
+              </w:rPr>
               <w:t>Component / Control / Field Width / Height Rules</w:t>
             </w:r>
           </w:p>
@@ -36465,19 +36858,34 @@
             <w:tcW w:type="dxa" w:w="5717"/>
           </w:tcPr>
           <w:p>
-            <w:r>
+            <w:pPr>
+              <w:spacing w:before="0" w:after="0" w:line="240" w:lineRule="auto"/>
+            </w:pPr>
+            <w:r>
+              <w:rPr>
+                <w:sz w:val="16"/>
+              </w:rPr>
               <w:t>Use current Control/Field Dimensions or shared component token. State transitions MUST NOT cause layout jump.</w:t>
             </w:r>
           </w:p>
         </w:tc>
       </w:tr>
       <w:tr>
+        <w:trPr>
+          <w:cantSplit/>
+        </w:trPr>
         <w:tc>
           <w:tcPr>
             <w:tcW w:type="dxa" w:w="5717"/>
           </w:tcPr>
           <w:p>
-            <w:r>
+            <w:pPr>
+              <w:spacing w:before="0" w:after="0" w:line="240" w:lineRule="auto"/>
+            </w:pPr>
+            <w:r>
+              <w:rPr>
+                <w:sz w:val="16"/>
+              </w:rPr>
               <w:t>Min / Max Width / Height</w:t>
             </w:r>
           </w:p>
@@ -36487,19 +36895,34 @@
             <w:tcW w:type="dxa" w:w="5717"/>
           </w:tcPr>
           <w:p>
-            <w:r>
+            <w:pPr>
+              <w:spacing w:before="0" w:after="0" w:line="240" w:lineRule="auto"/>
+            </w:pPr>
+            <w:r>
+              <w:rPr>
+                <w:sz w:val="16"/>
+              </w:rPr>
               <w:t>Inherit current exact values where present; otherwise shared component minimums apply. Required input/button content may not compress below its registered usable size.</w:t>
             </w:r>
           </w:p>
         </w:tc>
       </w:tr>
       <w:tr>
+        <w:trPr>
+          <w:cantSplit/>
+        </w:trPr>
         <w:tc>
           <w:tcPr>
             <w:tcW w:type="dxa" w:w="5717"/>
           </w:tcPr>
           <w:p>
-            <w:r>
+            <w:pPr>
+              <w:spacing w:before="0" w:after="0" w:line="240" w:lineRule="auto"/>
+            </w:pPr>
+            <w:r>
+              <w:rPr>
+                <w:sz w:val="16"/>
+              </w:rPr>
               <w:t>Gap / Padding / Alignment</w:t>
             </w:r>
           </w:p>
@@ -36509,19 +36932,34 @@
             <w:tcW w:type="dxa" w:w="5717"/>
           </w:tcPr>
           <w:p>
-            <w:r>
+            <w:pPr>
+              <w:spacing w:before="0" w:after="0" w:line="240" w:lineRule="auto"/>
+            </w:pPr>
+            <w:r>
+              <w:rPr>
+                <w:sz w:val="16"/>
+              </w:rPr>
               <w:t>Use current page spacing/grid tokens; alignment changes outside token tolerance require Visual Review.</w:t>
             </w:r>
           </w:p>
         </w:tc>
       </w:tr>
       <w:tr>
+        <w:trPr>
+          <w:cantSplit/>
+        </w:trPr>
         <w:tc>
           <w:tcPr>
             <w:tcW w:type="dxa" w:w="5717"/>
           </w:tcPr>
           <w:p>
-            <w:r>
+            <w:pPr>
+              <w:spacing w:before="0" w:after="0" w:line="240" w:lineRule="auto"/>
+            </w:pPr>
+            <w:r>
+              <w:rPr>
+                <w:sz w:val="16"/>
+              </w:rPr>
               <w:t>Aspect Ratio</w:t>
             </w:r>
           </w:p>
@@ -36531,19 +36969,34 @@
             <w:tcW w:type="dxa" w:w="5717"/>
           </w:tcPr>
           <w:p>
-            <w:r>
+            <w:pPr>
+              <w:spacing w:before="0" w:after="0" w:line="240" w:lineRule="auto"/>
+            </w:pPr>
+            <w:r>
+              <w:rPr>
+                <w:sz w:val="16"/>
+              </w:rPr>
               <w:t>NOT_APPLICABLE unless the current page declares an image/video/preview ratio; when declared, the exact current ratio remains authoritative.</w:t>
             </w:r>
           </w:p>
         </w:tc>
       </w:tr>
       <w:tr>
+        <w:trPr>
+          <w:cantSplit/>
+        </w:trPr>
         <w:tc>
           <w:tcPr>
             <w:tcW w:type="dxa" w:w="5717"/>
           </w:tcPr>
           <w:p>
-            <w:r>
+            <w:pPr>
+              <w:spacing w:before="0" w:after="0" w:line="240" w:lineRule="auto"/>
+            </w:pPr>
+            <w:r>
+              <w:rPr>
+                <w:sz w:val="16"/>
+              </w:rPr>
               <w:t>Overflow / Scroll Rule</w:t>
             </w:r>
           </w:p>
@@ -36553,19 +37006,34 @@
             <w:tcW w:type="dxa" w:w="5717"/>
           </w:tcPr>
           <w:p>
-            <w:r>
+            <w:pPr>
+              <w:spacing w:before="0" w:after="0" w:line="240" w:lineRule="auto"/>
+            </w:pPr>
+            <w:r>
+              <w:rPr>
+                <w:sz w:val="16"/>
+              </w:rPr>
               <w:t>No hidden overflow for actionable content. Long technical values use existing ellipsis + tooltip/drawer rule; large tables may use the current controlled horizontal-scroll rule.</w:t>
             </w:r>
           </w:p>
         </w:tc>
       </w:tr>
       <w:tr>
+        <w:trPr>
+          <w:cantSplit/>
+        </w:trPr>
         <w:tc>
           <w:tcPr>
             <w:tcW w:type="dxa" w:w="5717"/>
           </w:tcPr>
           <w:p>
-            <w:r>
+            <w:pPr>
+              <w:spacing w:before="0" w:after="0" w:line="240" w:lineRule="auto"/>
+            </w:pPr>
+            <w:r>
+              <w:rPr>
+                <w:sz w:val="16"/>
+              </w:rPr>
               <w:t>Collapse / Stack / Wrap Rule</w:t>
             </w:r>
           </w:p>
@@ -36575,19 +37043,34 @@
             <w:tcW w:type="dxa" w:w="5717"/>
           </w:tcPr>
           <w:p>
-            <w:r>
+            <w:pPr>
+              <w:spacing w:before="0" w:after="0" w:line="240" w:lineRule="auto"/>
+            </w:pPr>
+            <w:r>
+              <w:rPr>
+                <w:sz w:val="16"/>
+              </w:rPr>
               <w:t>Reflow may stack/collapse only within the current responsive contract; semantic order, required adjacency and operation order MUST NOT change.</w:t>
             </w:r>
           </w:p>
         </w:tc>
       </w:tr>
       <w:tr>
+        <w:trPr>
+          <w:cantSplit/>
+        </w:trPr>
         <w:tc>
           <w:tcPr>
             <w:tcW w:type="dxa" w:w="5717"/>
           </w:tcPr>
           <w:p>
-            <w:r>
+            <w:pPr>
+              <w:spacing w:before="0" w:after="0" w:line="240" w:lineRule="auto"/>
+            </w:pPr>
+            <w:r>
+              <w:rPr>
+                <w:sz w:val="16"/>
+              </w:rPr>
               <w:t>Z-order / Overlay Rule</w:t>
             </w:r>
           </w:p>
@@ -36597,19 +37080,34 @@
             <w:tcW w:type="dxa" w:w="5717"/>
           </w:tcPr>
           <w:p>
-            <w:r>
+            <w:pPr>
+              <w:spacing w:before="0" w:after="0" w:line="240" w:lineRule="auto"/>
+            </w:pPr>
+            <w:r>
+              <w:rPr>
+                <w:sz w:val="16"/>
+              </w:rPr>
               <w:t>Global Header / Sidebar overlay / Dialog / Drawer layers remain above Workspace without blocking required content; overlay expansion MUST NOT reflow the primary Workspace unless explicitly specified.</w:t>
             </w:r>
           </w:p>
         </w:tc>
       </w:tr>
       <w:tr>
+        <w:trPr>
+          <w:cantSplit/>
+        </w:trPr>
         <w:tc>
           <w:tcPr>
             <w:tcW w:type="dxa" w:w="5717"/>
           </w:tcPr>
           <w:p>
-            <w:r>
+            <w:pPr>
+              <w:spacing w:before="0" w:after="0" w:line="240" w:lineRule="auto"/>
+            </w:pPr>
+            <w:r>
+              <w:rPr>
+                <w:sz w:val="16"/>
+              </w:rPr>
               <w:t>Text Capacity / Truncation / Wrap Rule</w:t>
             </w:r>
           </w:p>
@@ -36619,19 +37117,34 @@
             <w:tcW w:type="dxa" w:w="5717"/>
           </w:tcPr>
           <w:p>
-            <w:r>
+            <w:pPr>
+              <w:spacing w:before="0" w:after="0" w:line="240" w:lineRule="auto"/>
+            </w:pPr>
+            <w:r>
+              <w:rPr>
+                <w:sz w:val="16"/>
+              </w:rPr>
               <w:t>Required labels/status/error text may not be clipped. Long IDs/technical values use controlled ellipsis with recoverable full value; no silent semantic truncation.</w:t>
             </w:r>
           </w:p>
         </w:tc>
       </w:tr>
       <w:tr>
+        <w:trPr>
+          <w:cantSplit/>
+        </w:trPr>
         <w:tc>
           <w:tcPr>
             <w:tcW w:type="dxa" w:w="5717"/>
           </w:tcPr>
           <w:p>
-            <w:r>
+            <w:pPr>
+              <w:spacing w:before="0" w:after="0" w:line="240" w:lineRule="auto"/>
+            </w:pPr>
+            <w:r>
+              <w:rPr>
+                <w:sz w:val="16"/>
+              </w:rPr>
               <w:t>Asset Object-fit / Object-position</w:t>
             </w:r>
           </w:p>
@@ -36641,19 +37154,34 @@
             <w:tcW w:type="dxa" w:w="5717"/>
           </w:tcPr>
           <w:p>
-            <w:r>
+            <w:pPr>
+              <w:spacing w:before="0" w:after="0" w:line="240" w:lineRule="auto"/>
+            </w:pPr>
+            <w:r>
+              <w:rPr>
+                <w:sz w:val="16"/>
+              </w:rPr>
               <w:t>REFERENCE_ONLY → current Asset Binding owner when a formal visual asset exists; otherwise NOT_APPLICABLE.</w:t>
             </w:r>
           </w:p>
         </w:tc>
       </w:tr>
       <w:tr>
+        <w:trPr>
+          <w:cantSplit/>
+        </w:trPr>
         <w:tc>
           <w:tcPr>
             <w:tcW w:type="dxa" w:w="5717"/>
           </w:tcPr>
           <w:p>
-            <w:r>
+            <w:pPr>
+              <w:spacing w:before="0" w:after="0" w:line="240" w:lineRule="auto"/>
+            </w:pPr>
+            <w:r>
+              <w:rPr>
+                <w:sz w:val="16"/>
+              </w:rPr>
               <w:t>Locked Visual Anchors</w:t>
             </w:r>
           </w:p>
@@ -36663,19 +37191,34 @@
             <w:tcW w:type="dxa" w:w="5717"/>
           </w:tcPr>
           <w:p>
-            <w:r>
+            <w:pPr>
+              <w:spacing w:before="0" w:after="0" w:line="240" w:lineRule="auto"/>
+            </w:pPr>
+            <w:r>
+              <w:rPr>
+                <w:sz w:val="16"/>
+              </w:rPr>
               <w:t>Bound to the Visual Anchor Registry in this annex; unlisted regions are not implicitly editable.</w:t>
             </w:r>
           </w:p>
         </w:tc>
       </w:tr>
       <w:tr>
+        <w:trPr>
+          <w:cantSplit/>
+        </w:trPr>
         <w:tc>
           <w:tcPr>
             <w:tcW w:type="dxa" w:w="5717"/>
           </w:tcPr>
           <w:p>
-            <w:r>
+            <w:pPr>
+              <w:spacing w:before="0" w:after="0" w:line="240" w:lineRule="auto"/>
+            </w:pPr>
+            <w:r>
+              <w:rPr>
+                <w:sz w:val="16"/>
+              </w:rPr>
               <w:t>Allowed Tolerance / Diff Threshold</w:t>
             </w:r>
           </w:p>
@@ -36685,19 +37228,34 @@
             <w:tcW w:type="dxa" w:w="5717"/>
           </w:tcPr>
           <w:p>
-            <w:r>
+            <w:pPr>
+              <w:spacing w:before="0" w:after="0" w:line="240" w:lineRule="auto"/>
+            </w:pPr>
+            <w:r>
+              <w:rPr>
+                <w:sz w:val="16"/>
+              </w:rPr>
               <w:t>Locked anchors and structural grid: zero unapproved drift. Token-level micro adjustment is allowed only inside current Design Token/Layout rules; structural changes require Change Set + re-review.</w:t>
             </w:r>
           </w:p>
         </w:tc>
       </w:tr>
       <w:tr>
+        <w:trPr>
+          <w:cantSplit/>
+        </w:trPr>
         <w:tc>
           <w:tcPr>
             <w:tcW w:type="dxa" w:w="5717"/>
           </w:tcPr>
           <w:p>
-            <w:r>
+            <w:pPr>
+              <w:spacing w:before="0" w:after="0" w:line="240" w:lineRule="auto"/>
+            </w:pPr>
+            <w:r>
+              <w:rPr>
+                <w:sz w:val="16"/>
+              </w:rPr>
               <w:t>Geometry Failure Set</w:t>
             </w:r>
           </w:p>
@@ -36707,7 +37265,13 @@
             <w:tcW w:type="dxa" w:w="5717"/>
           </w:tcPr>
           <w:p>
-            <w:r>
+            <w:pPr>
+              <w:spacing w:before="0" w:after="0" w:line="240" w:lineRule="auto"/>
+            </w:pPr>
+            <w:r>
+              <w:rPr>
+                <w:sz w:val="16"/>
+              </w:rPr>
               <w:t>Detect overlap, clipping, horizontal overflow, unapproved scroll, control compression, unexpected wrap/stack, aspect drift, misalignment, sticky/fixed occlusion and header/sidebar/workspace collision.</w:t>
             </w:r>
           </w:p>

</xml_diff>